<commit_message>
corrige contenido faltante tras el merge (gitignore, DDL, README)
</commit_message>
<xml_diff>
--- a/DOCUMENTACION/ENTREGABLE 5/ENTREGABLE 5.docx
+++ b/DOCUMENTACION/ENTREGABLE 5/ENTREGABLE 5.docx
@@ -481,7 +481,7 @@
           <w:r>
             <w:fldChar w:fldCharType="separate"/>
           </w:r>
-          <w:hyperlink w:anchor="_Toc236851841" w:history="1">
+          <w:hyperlink w:anchor="_Toc237022968" w:history="1">
             <w:r>
               <w:rPr>
                 <w:rStyle w:val="Hipervnculo"/>
@@ -533,7 +533,7 @@
                 <w:noProof/>
                 <w:webHidden/>
               </w:rPr>
-              <w:instrText xml:space="preserve"> PAGEREF _Toc236851841 \h </w:instrText>
+              <w:instrText xml:space="preserve"> PAGEREF _Toc237022968 \h </w:instrText>
             </w:r>
             <w:r>
               <w:rPr>
@@ -581,7 +581,7 @@
               <w14:ligatures w14:val="standardContextual"/>
             </w:rPr>
           </w:pPr>
-          <w:hyperlink w:anchor="_Toc236851842" w:history="1">
+          <w:hyperlink w:anchor="_Toc237022969" w:history="1">
             <w:r>
               <w:rPr>
                 <w:rStyle w:val="Hipervnculo"/>
@@ -628,7 +628,7 @@
                 <w:noProof/>
                 <w:webHidden/>
               </w:rPr>
-              <w:instrText xml:space="preserve"> PAGEREF _Toc236851842 \h </w:instrText>
+              <w:instrText xml:space="preserve"> PAGEREF _Toc237022969 \h </w:instrText>
             </w:r>
             <w:r>
               <w:rPr>
@@ -676,7 +676,7 @@
               <w14:ligatures w14:val="standardContextual"/>
             </w:rPr>
           </w:pPr>
-          <w:hyperlink w:anchor="_Toc236851843" w:history="1">
+          <w:hyperlink w:anchor="_Toc237022970" w:history="1">
             <w:r>
               <w:rPr>
                 <w:rStyle w:val="Hipervnculo"/>
@@ -724,7 +724,7 @@
                 <w:noProof/>
                 <w:webHidden/>
               </w:rPr>
-              <w:instrText xml:space="preserve"> PAGEREF _Toc236851843 \h </w:instrText>
+              <w:instrText xml:space="preserve"> PAGEREF _Toc237022970 \h </w:instrText>
             </w:r>
             <w:r>
               <w:rPr>
@@ -772,7 +772,7 @@
               <w14:ligatures w14:val="standardContextual"/>
             </w:rPr>
           </w:pPr>
-          <w:hyperlink w:anchor="_Toc236851844" w:history="1">
+          <w:hyperlink w:anchor="_Toc237022971" w:history="1">
             <w:r>
               <w:rPr>
                 <w:rStyle w:val="Hipervnculo"/>
@@ -820,7 +820,7 @@
                 <w:noProof/>
                 <w:webHidden/>
               </w:rPr>
-              <w:instrText xml:space="preserve"> PAGEREF _Toc236851844 \h </w:instrText>
+              <w:instrText xml:space="preserve"> PAGEREF _Toc237022971 \h </w:instrText>
             </w:r>
             <w:r>
               <w:rPr>
@@ -868,7 +868,7 @@
               <w14:ligatures w14:val="standardContextual"/>
             </w:rPr>
           </w:pPr>
-          <w:hyperlink w:anchor="_Toc236851845" w:history="1">
+          <w:hyperlink w:anchor="_Toc237022972" w:history="1">
             <w:r>
               <w:rPr>
                 <w:rStyle w:val="Hipervnculo"/>
@@ -916,7 +916,7 @@
                 <w:noProof/>
                 <w:webHidden/>
               </w:rPr>
-              <w:instrText xml:space="preserve"> PAGEREF _Toc236851845 \h </w:instrText>
+              <w:instrText xml:space="preserve"> PAGEREF _Toc237022972 \h </w:instrText>
             </w:r>
             <w:r>
               <w:rPr>
@@ -964,7 +964,7 @@
               <w14:ligatures w14:val="standardContextual"/>
             </w:rPr>
           </w:pPr>
-          <w:hyperlink w:anchor="_Toc236851846" w:history="1">
+          <w:hyperlink w:anchor="_Toc237022973" w:history="1">
             <w:r>
               <w:rPr>
                 <w:rStyle w:val="Hipervnculo"/>
@@ -1012,7 +1012,7 @@
                 <w:noProof/>
                 <w:webHidden/>
               </w:rPr>
-              <w:instrText xml:space="preserve"> PAGEREF _Toc236851846 \h </w:instrText>
+              <w:instrText xml:space="preserve"> PAGEREF _Toc237022973 \h </w:instrText>
             </w:r>
             <w:r>
               <w:rPr>
@@ -1060,7 +1060,7 @@
               <w14:ligatures w14:val="standardContextual"/>
             </w:rPr>
           </w:pPr>
-          <w:hyperlink w:anchor="_Toc236851847" w:history="1">
+          <w:hyperlink w:anchor="_Toc237022974" w:history="1">
             <w:r>
               <w:rPr>
                 <w:rStyle w:val="Hipervnculo"/>
@@ -1108,7 +1108,7 @@
                 <w:noProof/>
                 <w:webHidden/>
               </w:rPr>
-              <w:instrText xml:space="preserve"> PAGEREF _Toc236851847 \h </w:instrText>
+              <w:instrText xml:space="preserve"> PAGEREF _Toc237022974 \h </w:instrText>
             </w:r>
             <w:r>
               <w:rPr>
@@ -1156,7 +1156,7 @@
               <w14:ligatures w14:val="standardContextual"/>
             </w:rPr>
           </w:pPr>
-          <w:hyperlink w:anchor="_Toc236851848" w:history="1">
+          <w:hyperlink w:anchor="_Toc237022975" w:history="1">
             <w:r>
               <w:rPr>
                 <w:rStyle w:val="Hipervnculo"/>
@@ -1204,7 +1204,7 @@
                 <w:noProof/>
                 <w:webHidden/>
               </w:rPr>
-              <w:instrText xml:space="preserve"> PAGEREF _Toc236851848 \h </w:instrText>
+              <w:instrText xml:space="preserve"> PAGEREF _Toc237022975 \h </w:instrText>
             </w:r>
             <w:r>
               <w:rPr>
@@ -1252,7 +1252,7 @@
               <w14:ligatures w14:val="standardContextual"/>
             </w:rPr>
           </w:pPr>
-          <w:hyperlink w:anchor="_Toc236851849" w:history="1">
+          <w:hyperlink w:anchor="_Toc237022976" w:history="1">
             <w:r>
               <w:rPr>
                 <w:rStyle w:val="Hipervnculo"/>
@@ -1300,7 +1300,7 @@
                 <w:noProof/>
                 <w:webHidden/>
               </w:rPr>
-              <w:instrText xml:space="preserve"> PAGEREF _Toc236851849 \h </w:instrText>
+              <w:instrText xml:space="preserve"> PAGEREF _Toc237022976 \h </w:instrText>
             </w:r>
             <w:r>
               <w:rPr>
@@ -1348,7 +1348,7 @@
               <w14:ligatures w14:val="standardContextual"/>
             </w:rPr>
           </w:pPr>
-          <w:hyperlink w:anchor="_Toc236851850" w:history="1">
+          <w:hyperlink w:anchor="_Toc237022977" w:history="1">
             <w:r>
               <w:rPr>
                 <w:rStyle w:val="Hipervnculo"/>
@@ -1396,7 +1396,7 @@
                 <w:noProof/>
                 <w:webHidden/>
               </w:rPr>
-              <w:instrText xml:space="preserve"> PAGEREF _Toc236851850 \h </w:instrText>
+              <w:instrText xml:space="preserve"> PAGEREF _Toc237022977 \h </w:instrText>
             </w:r>
             <w:r>
               <w:rPr>
@@ -1416,7 +1416,7 @@
                 <w:noProof/>
                 <w:webHidden/>
               </w:rPr>
-              <w:t>5</w:t>
+              <w:t>6</w:t>
             </w:r>
             <w:r>
               <w:rPr>
@@ -1444,7 +1444,7 @@
               <w14:ligatures w14:val="standardContextual"/>
             </w:rPr>
           </w:pPr>
-          <w:hyperlink w:anchor="_Toc236851851" w:history="1">
+          <w:hyperlink w:anchor="_Toc237022978" w:history="1">
             <w:r>
               <w:rPr>
                 <w:rStyle w:val="Hipervnculo"/>
@@ -1492,7 +1492,7 @@
                 <w:noProof/>
                 <w:webHidden/>
               </w:rPr>
-              <w:instrText xml:space="preserve"> PAGEREF _Toc236851851 \h </w:instrText>
+              <w:instrText xml:space="preserve"> PAGEREF _Toc237022978 \h </w:instrText>
             </w:r>
             <w:r>
               <w:rPr>
@@ -1540,7 +1540,7 @@
               <w14:ligatures w14:val="standardContextual"/>
             </w:rPr>
           </w:pPr>
-          <w:hyperlink w:anchor="_Toc236851852" w:history="1">
+          <w:hyperlink w:anchor="_Toc237022979" w:history="1">
             <w:r>
               <w:rPr>
                 <w:rStyle w:val="Hipervnculo"/>
@@ -1588,7 +1588,7 @@
                 <w:noProof/>
                 <w:webHidden/>
               </w:rPr>
-              <w:instrText xml:space="preserve"> PAGEREF _Toc236851852 \h </w:instrText>
+              <w:instrText xml:space="preserve"> PAGEREF _Toc237022979 \h </w:instrText>
             </w:r>
             <w:r>
               <w:rPr>
@@ -1636,7 +1636,7 @@
               <w14:ligatures w14:val="standardContextual"/>
             </w:rPr>
           </w:pPr>
-          <w:hyperlink w:anchor="_Toc236851853" w:history="1">
+          <w:hyperlink w:anchor="_Toc237022980" w:history="1">
             <w:r>
               <w:rPr>
                 <w:rStyle w:val="Hipervnculo"/>
@@ -1684,7 +1684,7 @@
                 <w:noProof/>
                 <w:webHidden/>
               </w:rPr>
-              <w:instrText xml:space="preserve"> PAGEREF _Toc236851853 \h </w:instrText>
+              <w:instrText xml:space="preserve"> PAGEREF _Toc237022980 \h </w:instrText>
             </w:r>
             <w:r>
               <w:rPr>
@@ -1732,7 +1732,7 @@
               <w14:ligatures w14:val="standardContextual"/>
             </w:rPr>
           </w:pPr>
-          <w:hyperlink w:anchor="_Toc236851854" w:history="1">
+          <w:hyperlink w:anchor="_Toc237022981" w:history="1">
             <w:r>
               <w:rPr>
                 <w:rStyle w:val="Hipervnculo"/>
@@ -1780,7 +1780,7 @@
                 <w:noProof/>
                 <w:webHidden/>
               </w:rPr>
-              <w:instrText xml:space="preserve"> PAGEREF _Toc236851854 \h </w:instrText>
+              <w:instrText xml:space="preserve"> PAGEREF _Toc237022981 \h </w:instrText>
             </w:r>
             <w:r>
               <w:rPr>
@@ -1800,7 +1800,7 @@
                 <w:noProof/>
                 <w:webHidden/>
               </w:rPr>
-              <w:t>6</w:t>
+              <w:t>7</w:t>
             </w:r>
             <w:r>
               <w:rPr>
@@ -1828,7 +1828,7 @@
               <w14:ligatures w14:val="standardContextual"/>
             </w:rPr>
           </w:pPr>
-          <w:hyperlink w:anchor="_Toc236851855" w:history="1">
+          <w:hyperlink w:anchor="_Toc237022982" w:history="1">
             <w:r>
               <w:rPr>
                 <w:rStyle w:val="Hipervnculo"/>
@@ -1855,7 +1855,7 @@
                 <w:rStyle w:val="Hipervnculo"/>
                 <w:noProof/>
               </w:rPr>
-              <w:t>DataTables y Tabulator</w:t>
+              <w:t>DataTables</w:t>
             </w:r>
             <w:r>
               <w:rPr>
@@ -1876,7 +1876,7 @@
                 <w:noProof/>
                 <w:webHidden/>
               </w:rPr>
-              <w:instrText xml:space="preserve"> PAGEREF _Toc236851855 \h </w:instrText>
+              <w:instrText xml:space="preserve"> PAGEREF _Toc237022982 \h </w:instrText>
             </w:r>
             <w:r>
               <w:rPr>
@@ -1924,7 +1924,7 @@
               <w14:ligatures w14:val="standardContextual"/>
             </w:rPr>
           </w:pPr>
-          <w:hyperlink w:anchor="_Toc236851856" w:history="1">
+          <w:hyperlink w:anchor="_Toc237022983" w:history="1">
             <w:r>
               <w:rPr>
                 <w:rStyle w:val="Hipervnculo"/>
@@ -1971,7 +1971,7 @@
                 <w:noProof/>
                 <w:webHidden/>
               </w:rPr>
-              <w:instrText xml:space="preserve"> PAGEREF _Toc236851856 \h </w:instrText>
+              <w:instrText xml:space="preserve"> PAGEREF _Toc237022983 \h </w:instrText>
             </w:r>
             <w:r>
               <w:rPr>
@@ -2019,7 +2019,7 @@
               <w14:ligatures w14:val="standardContextual"/>
             </w:rPr>
           </w:pPr>
-          <w:hyperlink w:anchor="_Toc236851857" w:history="1">
+          <w:hyperlink w:anchor="_Toc237022984" w:history="1">
             <w:r>
               <w:rPr>
                 <w:rStyle w:val="Hipervnculo"/>
@@ -2066,7 +2066,7 @@
                 <w:noProof/>
                 <w:webHidden/>
               </w:rPr>
-              <w:instrText xml:space="preserve"> PAGEREF _Toc236851857 \h </w:instrText>
+              <w:instrText xml:space="preserve"> PAGEREF _Toc237022984 \h </w:instrText>
             </w:r>
             <w:r>
               <w:rPr>
@@ -2086,7 +2086,487 @@
                 <w:noProof/>
                 <w:webHidden/>
               </w:rPr>
-              <w:t>7</w:t>
+              <w:t>10</w:t>
+            </w:r>
+            <w:r>
+              <w:rPr>
+                <w:noProof/>
+                <w:webHidden/>
+              </w:rPr>
+              <w:fldChar w:fldCharType="end"/>
+            </w:r>
+          </w:hyperlink>
+        </w:p>
+        <w:p>
+          <w:pPr>
+            <w:pStyle w:val="TDC2"/>
+            <w:tabs>
+              <w:tab w:val="left" w:pos="1200"/>
+              <w:tab w:val="right" w:leader="dot" w:pos="9962"/>
+            </w:tabs>
+            <w:rPr>
+              <w:rFonts w:eastAsiaTheme="minorEastAsia"/>
+              <w:noProof/>
+              <w:kern w:val="2"/>
+              <w:sz w:val="24"/>
+              <w:szCs w:val="24"/>
+              <w:lang w:eastAsia="es-CR"/>
+              <w14:ligatures w14:val="standardContextual"/>
+            </w:rPr>
+          </w:pPr>
+          <w:hyperlink w:anchor="_Toc237022985" w:history="1">
+            <w:r>
+              <w:rPr>
+                <w:rStyle w:val="Hipervnculo"/>
+                <w:rFonts w:cstheme="minorHAnsi"/>
+                <w:bCs/>
+                <w:noProof/>
+              </w:rPr>
+              <w:t>5.4.1.</w:t>
+            </w:r>
+            <w:r>
+              <w:rPr>
+                <w:rFonts w:eastAsiaTheme="minorEastAsia"/>
+                <w:noProof/>
+                <w:kern w:val="2"/>
+                <w:sz w:val="24"/>
+                <w:szCs w:val="24"/>
+                <w:lang w:eastAsia="es-CR"/>
+                <w14:ligatures w14:val="standardContextual"/>
+              </w:rPr>
+              <w:tab/>
+            </w:r>
+            <w:r>
+              <w:rPr>
+                <w:rStyle w:val="Hipervnculo"/>
+                <w:noProof/>
+              </w:rPr>
+              <w:t>Validación de datos</w:t>
+            </w:r>
+            <w:r>
+              <w:rPr>
+                <w:noProof/>
+                <w:webHidden/>
+              </w:rPr>
+              <w:tab/>
+            </w:r>
+            <w:r>
+              <w:rPr>
+                <w:noProof/>
+                <w:webHidden/>
+              </w:rPr>
+              <w:fldChar w:fldCharType="begin"/>
+            </w:r>
+            <w:r>
+              <w:rPr>
+                <w:noProof/>
+                <w:webHidden/>
+              </w:rPr>
+              <w:instrText xml:space="preserve"> PAGEREF _Toc237022985 \h </w:instrText>
+            </w:r>
+            <w:r>
+              <w:rPr>
+                <w:noProof/>
+                <w:webHidden/>
+              </w:rPr>
+            </w:r>
+            <w:r>
+              <w:rPr>
+                <w:noProof/>
+                <w:webHidden/>
+              </w:rPr>
+              <w:fldChar w:fldCharType="separate"/>
+            </w:r>
+            <w:r>
+              <w:rPr>
+                <w:noProof/>
+                <w:webHidden/>
+              </w:rPr>
+              <w:t>10</w:t>
+            </w:r>
+            <w:r>
+              <w:rPr>
+                <w:noProof/>
+                <w:webHidden/>
+              </w:rPr>
+              <w:fldChar w:fldCharType="end"/>
+            </w:r>
+          </w:hyperlink>
+        </w:p>
+        <w:p>
+          <w:pPr>
+            <w:pStyle w:val="TDC2"/>
+            <w:tabs>
+              <w:tab w:val="left" w:pos="1200"/>
+              <w:tab w:val="right" w:leader="dot" w:pos="9962"/>
+            </w:tabs>
+            <w:rPr>
+              <w:rFonts w:eastAsiaTheme="minorEastAsia"/>
+              <w:noProof/>
+              <w:kern w:val="2"/>
+              <w:sz w:val="24"/>
+              <w:szCs w:val="24"/>
+              <w:lang w:eastAsia="es-CR"/>
+              <w14:ligatures w14:val="standardContextual"/>
+            </w:rPr>
+          </w:pPr>
+          <w:hyperlink w:anchor="_Toc237022986" w:history="1">
+            <w:r>
+              <w:rPr>
+                <w:rStyle w:val="Hipervnculo"/>
+                <w:rFonts w:cstheme="minorHAnsi"/>
+                <w:bCs/>
+                <w:noProof/>
+              </w:rPr>
+              <w:t>5.4.2.</w:t>
+            </w:r>
+            <w:r>
+              <w:rPr>
+                <w:rFonts w:eastAsiaTheme="minorEastAsia"/>
+                <w:noProof/>
+                <w:kern w:val="2"/>
+                <w:sz w:val="24"/>
+                <w:szCs w:val="24"/>
+                <w:lang w:eastAsia="es-CR"/>
+                <w14:ligatures w14:val="standardContextual"/>
+              </w:rPr>
+              <w:tab/>
+            </w:r>
+            <w:r>
+              <w:rPr>
+                <w:rStyle w:val="Hipervnculo"/>
+                <w:noProof/>
+              </w:rPr>
+              <w:t>Pruebas de Control de acceso</w:t>
+            </w:r>
+            <w:r>
+              <w:rPr>
+                <w:noProof/>
+                <w:webHidden/>
+              </w:rPr>
+              <w:tab/>
+            </w:r>
+            <w:r>
+              <w:rPr>
+                <w:noProof/>
+                <w:webHidden/>
+              </w:rPr>
+              <w:fldChar w:fldCharType="begin"/>
+            </w:r>
+            <w:r>
+              <w:rPr>
+                <w:noProof/>
+                <w:webHidden/>
+              </w:rPr>
+              <w:instrText xml:space="preserve"> PAGEREF _Toc237022986 \h </w:instrText>
+            </w:r>
+            <w:r>
+              <w:rPr>
+                <w:noProof/>
+                <w:webHidden/>
+              </w:rPr>
+            </w:r>
+            <w:r>
+              <w:rPr>
+                <w:noProof/>
+                <w:webHidden/>
+              </w:rPr>
+              <w:fldChar w:fldCharType="separate"/>
+            </w:r>
+            <w:r>
+              <w:rPr>
+                <w:noProof/>
+                <w:webHidden/>
+              </w:rPr>
+              <w:t>13</w:t>
+            </w:r>
+            <w:r>
+              <w:rPr>
+                <w:noProof/>
+                <w:webHidden/>
+              </w:rPr>
+              <w:fldChar w:fldCharType="end"/>
+            </w:r>
+          </w:hyperlink>
+        </w:p>
+        <w:p>
+          <w:pPr>
+            <w:pStyle w:val="TDC2"/>
+            <w:tabs>
+              <w:tab w:val="left" w:pos="1200"/>
+              <w:tab w:val="right" w:leader="dot" w:pos="9962"/>
+            </w:tabs>
+            <w:rPr>
+              <w:rFonts w:eastAsiaTheme="minorEastAsia"/>
+              <w:noProof/>
+              <w:kern w:val="2"/>
+              <w:sz w:val="24"/>
+              <w:szCs w:val="24"/>
+              <w:lang w:eastAsia="es-CR"/>
+              <w14:ligatures w14:val="standardContextual"/>
+            </w:rPr>
+          </w:pPr>
+          <w:hyperlink w:anchor="_Toc237022987" w:history="1">
+            <w:r>
+              <w:rPr>
+                <w:rStyle w:val="Hipervnculo"/>
+                <w:rFonts w:cstheme="minorHAnsi"/>
+                <w:bCs/>
+                <w:noProof/>
+              </w:rPr>
+              <w:t>5.4.3.</w:t>
+            </w:r>
+            <w:r>
+              <w:rPr>
+                <w:rFonts w:eastAsiaTheme="minorEastAsia"/>
+                <w:noProof/>
+                <w:kern w:val="2"/>
+                <w:sz w:val="24"/>
+                <w:szCs w:val="24"/>
+                <w:lang w:eastAsia="es-CR"/>
+                <w14:ligatures w14:val="standardContextual"/>
+              </w:rPr>
+              <w:tab/>
+            </w:r>
+            <w:r>
+              <w:rPr>
+                <w:rStyle w:val="Hipervnculo"/>
+                <w:noProof/>
+              </w:rPr>
+              <w:t>Pruebas funcionales</w:t>
+            </w:r>
+            <w:r>
+              <w:rPr>
+                <w:noProof/>
+                <w:webHidden/>
+              </w:rPr>
+              <w:tab/>
+            </w:r>
+            <w:r>
+              <w:rPr>
+                <w:noProof/>
+                <w:webHidden/>
+              </w:rPr>
+              <w:fldChar w:fldCharType="begin"/>
+            </w:r>
+            <w:r>
+              <w:rPr>
+                <w:noProof/>
+                <w:webHidden/>
+              </w:rPr>
+              <w:instrText xml:space="preserve"> PAGEREF _Toc237022987 \h </w:instrText>
+            </w:r>
+            <w:r>
+              <w:rPr>
+                <w:noProof/>
+                <w:webHidden/>
+              </w:rPr>
+            </w:r>
+            <w:r>
+              <w:rPr>
+                <w:noProof/>
+                <w:webHidden/>
+              </w:rPr>
+              <w:fldChar w:fldCharType="separate"/>
+            </w:r>
+            <w:r>
+              <w:rPr>
+                <w:noProof/>
+                <w:webHidden/>
+              </w:rPr>
+              <w:t>14</w:t>
+            </w:r>
+            <w:r>
+              <w:rPr>
+                <w:noProof/>
+                <w:webHidden/>
+              </w:rPr>
+              <w:fldChar w:fldCharType="end"/>
+            </w:r>
+          </w:hyperlink>
+        </w:p>
+        <w:p>
+          <w:pPr>
+            <w:pStyle w:val="TDC2"/>
+            <w:tabs>
+              <w:tab w:val="left" w:pos="1200"/>
+              <w:tab w:val="right" w:leader="dot" w:pos="9962"/>
+            </w:tabs>
+            <w:rPr>
+              <w:rFonts w:eastAsiaTheme="minorEastAsia"/>
+              <w:noProof/>
+              <w:kern w:val="2"/>
+              <w:sz w:val="24"/>
+              <w:szCs w:val="24"/>
+              <w:lang w:eastAsia="es-CR"/>
+              <w14:ligatures w14:val="standardContextual"/>
+            </w:rPr>
+          </w:pPr>
+          <w:hyperlink w:anchor="_Toc237022988" w:history="1">
+            <w:r>
+              <w:rPr>
+                <w:rStyle w:val="Hipervnculo"/>
+                <w:rFonts w:cstheme="minorHAnsi"/>
+                <w:bCs/>
+                <w:noProof/>
+              </w:rPr>
+              <w:t>5.4.4.</w:t>
+            </w:r>
+            <w:r>
+              <w:rPr>
+                <w:rFonts w:eastAsiaTheme="minorEastAsia"/>
+                <w:noProof/>
+                <w:kern w:val="2"/>
+                <w:sz w:val="24"/>
+                <w:szCs w:val="24"/>
+                <w:lang w:eastAsia="es-CR"/>
+                <w14:ligatures w14:val="standardContextual"/>
+              </w:rPr>
+              <w:tab/>
+            </w:r>
+            <w:r>
+              <w:rPr>
+                <w:rStyle w:val="Hipervnculo"/>
+                <w:noProof/>
+              </w:rPr>
+              <w:t>Pruebas de Carga de datos</w:t>
+            </w:r>
+            <w:r>
+              <w:rPr>
+                <w:noProof/>
+                <w:webHidden/>
+              </w:rPr>
+              <w:tab/>
+            </w:r>
+            <w:r>
+              <w:rPr>
+                <w:noProof/>
+                <w:webHidden/>
+              </w:rPr>
+              <w:fldChar w:fldCharType="begin"/>
+            </w:r>
+            <w:r>
+              <w:rPr>
+                <w:noProof/>
+                <w:webHidden/>
+              </w:rPr>
+              <w:instrText xml:space="preserve"> PAGEREF _Toc237022988 \h </w:instrText>
+            </w:r>
+            <w:r>
+              <w:rPr>
+                <w:noProof/>
+                <w:webHidden/>
+              </w:rPr>
+            </w:r>
+            <w:r>
+              <w:rPr>
+                <w:noProof/>
+                <w:webHidden/>
+              </w:rPr>
+              <w:fldChar w:fldCharType="separate"/>
+            </w:r>
+            <w:r>
+              <w:rPr>
+                <w:noProof/>
+                <w:webHidden/>
+              </w:rPr>
+              <w:t>17</w:t>
+            </w:r>
+            <w:r>
+              <w:rPr>
+                <w:noProof/>
+                <w:webHidden/>
+              </w:rPr>
+              <w:fldChar w:fldCharType="end"/>
+            </w:r>
+          </w:hyperlink>
+        </w:p>
+        <w:p>
+          <w:pPr>
+            <w:pStyle w:val="TDC2"/>
+            <w:tabs>
+              <w:tab w:val="left" w:pos="1200"/>
+              <w:tab w:val="right" w:leader="dot" w:pos="9962"/>
+            </w:tabs>
+            <w:rPr>
+              <w:rFonts w:eastAsiaTheme="minorEastAsia"/>
+              <w:noProof/>
+              <w:kern w:val="2"/>
+              <w:sz w:val="24"/>
+              <w:szCs w:val="24"/>
+              <w:lang w:eastAsia="es-CR"/>
+              <w14:ligatures w14:val="standardContextual"/>
+            </w:rPr>
+          </w:pPr>
+          <w:hyperlink w:anchor="_Toc237022989" w:history="1">
+            <w:r>
+              <w:rPr>
+                <w:rStyle w:val="Hipervnculo"/>
+                <w:rFonts w:cstheme="minorHAnsi"/>
+                <w:bCs/>
+                <w:noProof/>
+              </w:rPr>
+              <w:t>5.4.5.</w:t>
+            </w:r>
+            <w:r>
+              <w:rPr>
+                <w:rFonts w:eastAsiaTheme="minorEastAsia"/>
+                <w:noProof/>
+                <w:kern w:val="2"/>
+                <w:sz w:val="24"/>
+                <w:szCs w:val="24"/>
+                <w:lang w:eastAsia="es-CR"/>
+                <w14:ligatures w14:val="standardContextual"/>
+              </w:rPr>
+              <w:tab/>
+            </w:r>
+            <w:r>
+              <w:rPr>
+                <w:rStyle w:val="Hipervnculo"/>
+                <w:noProof/>
+              </w:rPr>
+              <w:t>Pruebas de Seguridad</w:t>
+            </w:r>
+            <w:r>
+              <w:rPr>
+                <w:noProof/>
+                <w:webHidden/>
+              </w:rPr>
+              <w:tab/>
+            </w:r>
+            <w:r>
+              <w:rPr>
+                <w:noProof/>
+                <w:webHidden/>
+              </w:rPr>
+              <w:fldChar w:fldCharType="begin"/>
+            </w:r>
+            <w:r>
+              <w:rPr>
+                <w:noProof/>
+                <w:webHidden/>
+              </w:rPr>
+              <w:instrText xml:space="preserve"> PAGEREF _Toc237022989 \h </w:instrText>
+            </w:r>
+            <w:r>
+              <w:rPr>
+                <w:noProof/>
+                <w:webHidden/>
+              </w:rPr>
+            </w:r>
+            <w:r>
+              <w:rPr>
+                <w:noProof/>
+                <w:webHidden/>
+              </w:rPr>
+              <w:fldChar w:fldCharType="separate"/>
+            </w:r>
+            <w:r>
+              <w:rPr>
+                <w:noProof/>
+                <w:webHidden/>
+              </w:rPr>
+              <w:t>20</w:t>
             </w:r>
             <w:r>
               <w:rPr>
@@ -2114,7 +2594,7 @@
               <w14:ligatures w14:val="standardContextual"/>
             </w:rPr>
           </w:pPr>
-          <w:hyperlink w:anchor="_Toc236851858" w:history="1">
+          <w:hyperlink w:anchor="_Toc237022990" w:history="1">
             <w:r>
               <w:rPr>
                 <w:rStyle w:val="Hipervnculo"/>
@@ -2161,7 +2641,7 @@
                 <w:noProof/>
                 <w:webHidden/>
               </w:rPr>
-              <w:instrText xml:space="preserve"> PAGEREF _Toc236851858 \h </w:instrText>
+              <w:instrText xml:space="preserve"> PAGEREF _Toc237022990 \h </w:instrText>
             </w:r>
             <w:r>
               <w:rPr>
@@ -2181,7 +2661,7 @@
                 <w:noProof/>
                 <w:webHidden/>
               </w:rPr>
-              <w:t>7</w:t>
+              <w:t>22</w:t>
             </w:r>
             <w:r>
               <w:rPr>
@@ -2209,7 +2689,7 @@
               <w14:ligatures w14:val="standardContextual"/>
             </w:rPr>
           </w:pPr>
-          <w:hyperlink w:anchor="_Toc236851859" w:history="1">
+          <w:hyperlink w:anchor="_Toc237022991" w:history="1">
             <w:r>
               <w:rPr>
                 <w:rStyle w:val="Hipervnculo"/>
@@ -2256,7 +2736,7 @@
                 <w:noProof/>
                 <w:webHidden/>
               </w:rPr>
-              <w:instrText xml:space="preserve"> PAGEREF _Toc236851859 \h </w:instrText>
+              <w:instrText xml:space="preserve"> PAGEREF _Toc237022991 \h </w:instrText>
             </w:r>
             <w:r>
               <w:rPr>
@@ -2276,7 +2756,7 @@
                 <w:noProof/>
                 <w:webHidden/>
               </w:rPr>
-              <w:t>7</w:t>
+              <w:t>23</w:t>
             </w:r>
             <w:r>
               <w:rPr>
@@ -2304,7 +2784,7 @@
               <w14:ligatures w14:val="standardContextual"/>
             </w:rPr>
           </w:pPr>
-          <w:hyperlink w:anchor="_Toc236851860" w:history="1">
+          <w:hyperlink w:anchor="_Toc237022992" w:history="1">
             <w:r>
               <w:rPr>
                 <w:rStyle w:val="Hipervnculo"/>
@@ -2351,7 +2831,7 @@
                 <w:noProof/>
                 <w:webHidden/>
               </w:rPr>
-              <w:instrText xml:space="preserve"> PAGEREF _Toc236851860 \h </w:instrText>
+              <w:instrText xml:space="preserve"> PAGEREF _Toc237022992 \h </w:instrText>
             </w:r>
             <w:r>
               <w:rPr>
@@ -2371,102 +2851,7 @@
                 <w:noProof/>
                 <w:webHidden/>
               </w:rPr>
-              <w:t>7</w:t>
-            </w:r>
-            <w:r>
-              <w:rPr>
-                <w:noProof/>
-                <w:webHidden/>
-              </w:rPr>
-              <w:fldChar w:fldCharType="end"/>
-            </w:r>
-          </w:hyperlink>
-        </w:p>
-        <w:p>
-          <w:pPr>
-            <w:pStyle w:val="TDC1"/>
-            <w:tabs>
-              <w:tab w:val="left" w:pos="720"/>
-              <w:tab w:val="right" w:leader="dot" w:pos="9962"/>
-            </w:tabs>
-            <w:rPr>
-              <w:rFonts w:eastAsiaTheme="minorEastAsia"/>
-              <w:noProof/>
-              <w:kern w:val="2"/>
-              <w:sz w:val="24"/>
-              <w:szCs w:val="24"/>
-              <w:lang w:eastAsia="es-CR"/>
-              <w14:ligatures w14:val="standardContextual"/>
-            </w:rPr>
-          </w:pPr>
-          <w:hyperlink w:anchor="_Toc236851861" w:history="1">
-            <w:r>
-              <w:rPr>
-                <w:rStyle w:val="Hipervnculo"/>
-                <w:bCs/>
-                <w:noProof/>
-              </w:rPr>
-              <w:t>5.8.</w:t>
-            </w:r>
-            <w:r>
-              <w:rPr>
-                <w:rFonts w:eastAsiaTheme="minorEastAsia"/>
-                <w:noProof/>
-                <w:kern w:val="2"/>
-                <w:sz w:val="24"/>
-                <w:szCs w:val="24"/>
-                <w:lang w:eastAsia="es-CR"/>
-                <w14:ligatures w14:val="standardContextual"/>
-              </w:rPr>
-              <w:tab/>
-            </w:r>
-            <w:r>
-              <w:rPr>
-                <w:rStyle w:val="Hipervnculo"/>
-                <w:noProof/>
-              </w:rPr>
-              <w:t>ANEXOS</w:t>
-            </w:r>
-            <w:r>
-              <w:rPr>
-                <w:noProof/>
-                <w:webHidden/>
-              </w:rPr>
-              <w:tab/>
-            </w:r>
-            <w:r>
-              <w:rPr>
-                <w:noProof/>
-                <w:webHidden/>
-              </w:rPr>
-              <w:fldChar w:fldCharType="begin"/>
-            </w:r>
-            <w:r>
-              <w:rPr>
-                <w:noProof/>
-                <w:webHidden/>
-              </w:rPr>
-              <w:instrText xml:space="preserve"> PAGEREF _Toc236851861 \h </w:instrText>
-            </w:r>
-            <w:r>
-              <w:rPr>
-                <w:noProof/>
-                <w:webHidden/>
-              </w:rPr>
-            </w:r>
-            <w:r>
-              <w:rPr>
-                <w:noProof/>
-                <w:webHidden/>
-              </w:rPr>
-              <w:fldChar w:fldCharType="separate"/>
-            </w:r>
-            <w:r>
-              <w:rPr>
-                <w:noProof/>
-                <w:webHidden/>
-              </w:rPr>
-              <w:t>7</w:t>
+              <w:t>24</w:t>
             </w:r>
             <w:r>
               <w:rPr>
@@ -2574,10 +2959,12 @@
       <w:bookmarkStart w:id="15" w:name="_Toc233567760"/>
       <w:bookmarkStart w:id="16" w:name="_Toc236833716"/>
       <w:bookmarkStart w:id="17" w:name="_Toc236851836"/>
+      <w:bookmarkStart w:id="18" w:name="_Toc237022963"/>
       <w:bookmarkEnd w:id="14"/>
       <w:bookmarkEnd w:id="15"/>
       <w:bookmarkEnd w:id="16"/>
       <w:bookmarkEnd w:id="17"/>
+      <w:bookmarkEnd w:id="18"/>
     </w:p>
     <w:p>
       <w:pPr>
@@ -2604,14 +2991,16 @@
           <w:szCs w:val="24"/>
         </w:rPr>
       </w:pPr>
-      <w:bookmarkStart w:id="18" w:name="_Toc233567406"/>
-      <w:bookmarkStart w:id="19" w:name="_Toc233567761"/>
-      <w:bookmarkStart w:id="20" w:name="_Toc236833717"/>
-      <w:bookmarkStart w:id="21" w:name="_Toc236851837"/>
-      <w:bookmarkEnd w:id="18"/>
+      <w:bookmarkStart w:id="19" w:name="_Toc233567406"/>
+      <w:bookmarkStart w:id="20" w:name="_Toc233567761"/>
+      <w:bookmarkStart w:id="21" w:name="_Toc236833717"/>
+      <w:bookmarkStart w:id="22" w:name="_Toc236851837"/>
+      <w:bookmarkStart w:id="23" w:name="_Toc237022964"/>
       <w:bookmarkEnd w:id="19"/>
       <w:bookmarkEnd w:id="20"/>
       <w:bookmarkEnd w:id="21"/>
+      <w:bookmarkEnd w:id="22"/>
+      <w:bookmarkEnd w:id="23"/>
     </w:p>
     <w:p>
       <w:pPr>
@@ -2638,14 +3027,16 @@
           <w:szCs w:val="24"/>
         </w:rPr>
       </w:pPr>
-      <w:bookmarkStart w:id="22" w:name="_Toc233567407"/>
-      <w:bookmarkStart w:id="23" w:name="_Toc233567762"/>
-      <w:bookmarkStart w:id="24" w:name="_Toc236833718"/>
-      <w:bookmarkStart w:id="25" w:name="_Toc236851838"/>
-      <w:bookmarkEnd w:id="22"/>
-      <w:bookmarkEnd w:id="23"/>
+      <w:bookmarkStart w:id="24" w:name="_Toc233567407"/>
+      <w:bookmarkStart w:id="25" w:name="_Toc233567762"/>
+      <w:bookmarkStart w:id="26" w:name="_Toc236833718"/>
+      <w:bookmarkStart w:id="27" w:name="_Toc236851838"/>
+      <w:bookmarkStart w:id="28" w:name="_Toc237022965"/>
       <w:bookmarkEnd w:id="24"/>
       <w:bookmarkEnd w:id="25"/>
+      <w:bookmarkEnd w:id="26"/>
+      <w:bookmarkEnd w:id="27"/>
+      <w:bookmarkEnd w:id="28"/>
     </w:p>
     <w:p>
       <w:pPr>
@@ -2672,14 +3063,16 @@
           <w:szCs w:val="24"/>
         </w:rPr>
       </w:pPr>
-      <w:bookmarkStart w:id="26" w:name="_Toc233567408"/>
-      <w:bookmarkStart w:id="27" w:name="_Toc233567763"/>
-      <w:bookmarkStart w:id="28" w:name="_Toc236833719"/>
-      <w:bookmarkStart w:id="29" w:name="_Toc236851839"/>
-      <w:bookmarkEnd w:id="26"/>
-      <w:bookmarkEnd w:id="27"/>
-      <w:bookmarkEnd w:id="28"/>
+      <w:bookmarkStart w:id="29" w:name="_Toc233567408"/>
+      <w:bookmarkStart w:id="30" w:name="_Toc233567763"/>
+      <w:bookmarkStart w:id="31" w:name="_Toc236833719"/>
+      <w:bookmarkStart w:id="32" w:name="_Toc236851839"/>
+      <w:bookmarkStart w:id="33" w:name="_Toc237022966"/>
       <w:bookmarkEnd w:id="29"/>
+      <w:bookmarkEnd w:id="30"/>
+      <w:bookmarkEnd w:id="31"/>
+      <w:bookmarkEnd w:id="32"/>
+      <w:bookmarkEnd w:id="33"/>
     </w:p>
     <w:p>
       <w:pPr>
@@ -2706,14 +3099,16 @@
           <w:szCs w:val="24"/>
         </w:rPr>
       </w:pPr>
-      <w:bookmarkStart w:id="30" w:name="_Toc233567409"/>
-      <w:bookmarkStart w:id="31" w:name="_Toc233567764"/>
-      <w:bookmarkStart w:id="32" w:name="_Toc236833720"/>
-      <w:bookmarkStart w:id="33" w:name="_Toc236851840"/>
-      <w:bookmarkEnd w:id="30"/>
-      <w:bookmarkEnd w:id="31"/>
-      <w:bookmarkEnd w:id="32"/>
-      <w:bookmarkEnd w:id="33"/>
+      <w:bookmarkStart w:id="34" w:name="_Toc233567409"/>
+      <w:bookmarkStart w:id="35" w:name="_Toc233567764"/>
+      <w:bookmarkStart w:id="36" w:name="_Toc236833720"/>
+      <w:bookmarkStart w:id="37" w:name="_Toc236851840"/>
+      <w:bookmarkStart w:id="38" w:name="_Toc237022967"/>
+      <w:bookmarkEnd w:id="34"/>
+      <w:bookmarkEnd w:id="35"/>
+      <w:bookmarkEnd w:id="36"/>
+      <w:bookmarkEnd w:id="37"/>
+      <w:bookmarkEnd w:id="38"/>
     </w:p>
     <w:p>
       <w:pPr>
@@ -2727,7 +3122,7 @@
           <w:szCs w:val="24"/>
         </w:rPr>
       </w:pPr>
-      <w:bookmarkStart w:id="34" w:name="_Toc236851841"/>
+      <w:bookmarkStart w:id="39" w:name="_Toc237022968"/>
       <w:r>
         <w:rPr>
           <w:rFonts w:cstheme="minorHAnsi"/>
@@ -2738,7 +3133,7 @@
         </w:rPr>
         <w:t>INTRODUCCIÓN</w:t>
       </w:r>
-      <w:bookmarkEnd w:id="34"/>
+      <w:bookmarkEnd w:id="39"/>
     </w:p>
     <w:p/>
     <w:p>
@@ -2961,12 +3356,12 @@
       <w:pPr>
         <w:pStyle w:val="Ttulo1"/>
       </w:pPr>
-      <w:bookmarkStart w:id="35" w:name="_Toc236851842"/>
+      <w:bookmarkStart w:id="40" w:name="_Toc237022969"/>
       <w:r>
         <w:lastRenderedPageBreak/>
         <w:t>LENGUAJE DE PROGRAMACION, HERRAMIENTAS DE SOFTWARE Y APLICACIONES</w:t>
       </w:r>
-      <w:bookmarkEnd w:id="35"/>
+      <w:bookmarkEnd w:id="40"/>
     </w:p>
     <w:p/>
     <w:p>
@@ -3003,11 +3398,11 @@
       <w:pPr>
         <w:pStyle w:val="Ttulo2"/>
       </w:pPr>
-      <w:bookmarkStart w:id="36" w:name="_Toc236851843"/>
+      <w:bookmarkStart w:id="41" w:name="_Toc237022970"/>
       <w:r>
         <w:t>Python</w:t>
       </w:r>
-      <w:bookmarkEnd w:id="36"/>
+      <w:bookmarkEnd w:id="41"/>
     </w:p>
     <w:p/>
     <w:p>
@@ -3084,11 +3479,11 @@
       <w:pPr>
         <w:pStyle w:val="Ttulo2"/>
       </w:pPr>
-      <w:bookmarkStart w:id="37" w:name="_Toc236851844"/>
+      <w:bookmarkStart w:id="42" w:name="_Toc237022971"/>
       <w:r>
         <w:t>Django</w:t>
       </w:r>
-      <w:bookmarkEnd w:id="37"/>
+      <w:bookmarkEnd w:id="42"/>
     </w:p>
     <w:p/>
     <w:p>
@@ -3131,11 +3526,11 @@
       <w:pPr>
         <w:pStyle w:val="Ttulo2"/>
       </w:pPr>
-      <w:bookmarkStart w:id="38" w:name="_Toc236851845"/>
+      <w:bookmarkStart w:id="43" w:name="_Toc237022972"/>
       <w:r>
         <w:t>MySQL</w:t>
       </w:r>
-      <w:bookmarkEnd w:id="38"/>
+      <w:bookmarkEnd w:id="43"/>
     </w:p>
     <w:p/>
     <w:p>
@@ -3172,11 +3567,11 @@
       <w:pPr>
         <w:pStyle w:val="Ttulo2"/>
       </w:pPr>
-      <w:bookmarkStart w:id="39" w:name="_Toc236851846"/>
+      <w:bookmarkStart w:id="44" w:name="_Toc237022973"/>
       <w:r>
         <w:t>Visual Studio Code</w:t>
       </w:r>
-      <w:bookmarkEnd w:id="39"/>
+      <w:bookmarkEnd w:id="44"/>
     </w:p>
     <w:p/>
     <w:p>
@@ -3192,11 +3587,11 @@
       <w:pPr>
         <w:pStyle w:val="Ttulo2"/>
       </w:pPr>
-      <w:bookmarkStart w:id="40" w:name="_Toc236851847"/>
+      <w:bookmarkStart w:id="45" w:name="_Toc237022974"/>
       <w:r>
         <w:t>Git y GitHub</w:t>
       </w:r>
-      <w:bookmarkEnd w:id="40"/>
+      <w:bookmarkEnd w:id="45"/>
     </w:p>
     <w:p/>
     <w:p>
@@ -3212,11 +3607,11 @@
       <w:pPr>
         <w:pStyle w:val="Ttulo2"/>
       </w:pPr>
-      <w:bookmarkStart w:id="41" w:name="_Toc236851848"/>
+      <w:bookmarkStart w:id="46" w:name="_Toc237022975"/>
       <w:r>
         <w:t>Docker</w:t>
       </w:r>
-      <w:bookmarkEnd w:id="41"/>
+      <w:bookmarkEnd w:id="46"/>
     </w:p>
     <w:p/>
     <w:p>
@@ -3232,11 +3627,11 @@
       <w:pPr>
         <w:pStyle w:val="Ttulo2"/>
       </w:pPr>
-      <w:bookmarkStart w:id="42" w:name="_Toc236851849"/>
+      <w:bookmarkStart w:id="47" w:name="_Toc237022976"/>
       <w:r>
         <w:t>Cloudflare Tunnel</w:t>
       </w:r>
-      <w:bookmarkEnd w:id="42"/>
+      <w:bookmarkEnd w:id="47"/>
     </w:p>
     <w:p/>
     <w:p>
@@ -3252,11 +3647,11 @@
       <w:pPr>
         <w:pStyle w:val="Ttulo2"/>
       </w:pPr>
-      <w:bookmarkStart w:id="43" w:name="_Toc236851850"/>
+      <w:bookmarkStart w:id="48" w:name="_Toc237022977"/>
       <w:r>
         <w:t>Bootstrap 5 y Crispy Forms</w:t>
       </w:r>
-      <w:bookmarkEnd w:id="43"/>
+      <w:bookmarkEnd w:id="48"/>
     </w:p>
     <w:p/>
     <w:p>
@@ -3272,11 +3667,11 @@
       <w:pPr>
         <w:pStyle w:val="Ttulo2"/>
       </w:pPr>
-      <w:bookmarkStart w:id="44" w:name="_Toc236851851"/>
+      <w:bookmarkStart w:id="49" w:name="_Toc237022978"/>
       <w:r>
         <w:t>ReportLab</w:t>
       </w:r>
-      <w:bookmarkEnd w:id="44"/>
+      <w:bookmarkEnd w:id="49"/>
     </w:p>
     <w:p/>
     <w:p>
@@ -3292,11 +3687,11 @@
       <w:pPr>
         <w:pStyle w:val="Ttulo2"/>
       </w:pPr>
-      <w:bookmarkStart w:id="45" w:name="_Toc236851852"/>
+      <w:bookmarkStart w:id="50" w:name="_Toc237022979"/>
       <w:r>
         <w:t>OpenPyXL</w:t>
       </w:r>
-      <w:bookmarkEnd w:id="45"/>
+      <w:bookmarkEnd w:id="50"/>
     </w:p>
     <w:p/>
     <w:p>
@@ -3315,11 +3710,11 @@
       <w:r>
         <w:t xml:space="preserve"> </w:t>
       </w:r>
-      <w:bookmarkStart w:id="46" w:name="_Toc236851853"/>
+      <w:bookmarkStart w:id="51" w:name="_Toc237022980"/>
       <w:r>
         <w:t>Pandas</w:t>
       </w:r>
-      <w:bookmarkEnd w:id="46"/>
+      <w:bookmarkEnd w:id="51"/>
     </w:p>
     <w:p/>
     <w:p>
@@ -3342,11 +3737,11 @@
         <w:lastRenderedPageBreak/>
         <w:t xml:space="preserve"> </w:t>
       </w:r>
-      <w:bookmarkStart w:id="47" w:name="_Toc236851854"/>
+      <w:bookmarkStart w:id="52" w:name="_Toc237022981"/>
       <w:r>
         <w:t>Google OAuth 2.0</w:t>
       </w:r>
-      <w:bookmarkEnd w:id="47"/>
+      <w:bookmarkEnd w:id="52"/>
     </w:p>
     <w:p/>
     <w:p>
@@ -3376,11 +3771,14 @@
       <w:pPr>
         <w:pStyle w:val="Ttulo2"/>
       </w:pPr>
-      <w:bookmarkStart w:id="48" w:name="_Toc236851855"/>
-      <w:r>
-        <w:t xml:space="preserve">DataTables </w:t>
-      </w:r>
-      <w:bookmarkEnd w:id="48"/>
+      <w:bookmarkStart w:id="53" w:name="_Toc237022982"/>
+      <w:r>
+        <w:t>DataTables</w:t>
+      </w:r>
+      <w:bookmarkEnd w:id="53"/>
+      <w:r>
+        <w:t xml:space="preserve"> </w:t>
+      </w:r>
     </w:p>
     <w:p/>
     <w:p>
@@ -3396,11 +3794,11 @@
       <w:pPr>
         <w:pStyle w:val="Ttulo1"/>
       </w:pPr>
-      <w:bookmarkStart w:id="49" w:name="_Toc236851856"/>
+      <w:bookmarkStart w:id="54" w:name="_Toc237022983"/>
       <w:r>
         <w:t>CODIFICACIÓN O LENGUAJE FUENTE</w:t>
       </w:r>
-      <w:bookmarkEnd w:id="49"/>
+      <w:bookmarkEnd w:id="54"/>
     </w:p>
     <w:p/>
     <w:p>
@@ -3562,10 +3960,10 @@
                   <v:path o:extrusionok="f" gradientshapeok="t" o:connecttype="rect"/>
                   <o:lock v:ext="edit" aspectratio="t"/>
                 </v:shapetype>
-                <v:shape id="_x0000_i1049" type="#_x0000_t75" style="width:43.75pt;height:41.45pt" o:ole="">
+                <v:shape id="_x0000_i1025" type="#_x0000_t75" style="width:43.75pt;height:41.45pt" o:ole="">
                   <v:imagedata r:id="rId8" o:title=""/>
                 </v:shape>
-                <o:OLEObject Type="Embed" ProgID="Package" ShapeID="_x0000_i1049" DrawAspect="Content" ObjectID="_1847564822" r:id="rId9"/>
+                <o:OLEObject Type="Embed" ProgID="Package" ShapeID="_x0000_i1025" DrawAspect="Content" ObjectID="_1847635945" r:id="rId9"/>
               </w:object>
             </w:r>
           </w:p>
@@ -3612,10 +4010,10 @@
             </w:pPr>
             <w:r>
               <w:object w:dxaOrig="1071" w:dyaOrig="831" w14:anchorId="0B193CC1">
-                <v:shape id="_x0000_i1051" type="#_x0000_t75" style="width:53.75pt;height:41.45pt" o:ole="">
+                <v:shape id="_x0000_i1026" type="#_x0000_t75" style="width:53.75pt;height:41.45pt" o:ole="">
                   <v:imagedata r:id="rId10" o:title=""/>
                 </v:shape>
-                <o:OLEObject Type="Embed" ProgID="Package" ShapeID="_x0000_i1051" DrawAspect="Content" ObjectID="_1847564823" r:id="rId11"/>
+                <o:OLEObject Type="Embed" ProgID="Package" ShapeID="_x0000_i1026" DrawAspect="Content" ObjectID="_1847635946" r:id="rId11"/>
               </w:object>
             </w:r>
           </w:p>
@@ -3662,10 +4060,10 @@
             </w:pPr>
             <w:r>
               <w:object w:dxaOrig="1501" w:dyaOrig="831" w14:anchorId="34801BE5">
-                <v:shape id="_x0000_i1053" type="#_x0000_t75" style="width:75.2pt;height:41.45pt" o:ole="">
+                <v:shape id="_x0000_i1027" type="#_x0000_t75" style="width:75.2pt;height:41.45pt" o:ole="">
                   <v:imagedata r:id="rId12" o:title=""/>
                 </v:shape>
-                <o:OLEObject Type="Embed" ProgID="Package" ShapeID="_x0000_i1053" DrawAspect="Content" ObjectID="_1847564824" r:id="rId13"/>
+                <o:OLEObject Type="Embed" ProgID="Package" ShapeID="_x0000_i1027" DrawAspect="Content" ObjectID="_1847635947" r:id="rId13"/>
               </w:object>
             </w:r>
           </w:p>
@@ -3712,10 +4110,10 @@
             </w:pPr>
             <w:r>
               <w:object w:dxaOrig="1051" w:dyaOrig="831" w14:anchorId="38FE033D">
-                <v:shape id="_x0000_i1055" type="#_x0000_t75" style="width:52.4pt;height:41.45pt" o:ole="">
+                <v:shape id="_x0000_i1028" type="#_x0000_t75" style="width:52.4pt;height:41.45pt" o:ole="">
                   <v:imagedata r:id="rId14" o:title=""/>
                 </v:shape>
-                <o:OLEObject Type="Embed" ProgID="Package" ShapeID="_x0000_i1055" DrawAspect="Content" ObjectID="_1847564825" r:id="rId15"/>
+                <o:OLEObject Type="Embed" ProgID="Package" ShapeID="_x0000_i1028" DrawAspect="Content" ObjectID="_1847635948" r:id="rId15"/>
               </w:object>
             </w:r>
           </w:p>
@@ -3766,10 +4164,10 @@
             </w:pPr>
             <w:r>
               <w:object w:dxaOrig="850" w:dyaOrig="831" w14:anchorId="7AFE80FC">
-                <v:shape id="_x0000_i1057" type="#_x0000_t75" style="width:42.4pt;height:41.45pt" o:ole="">
+                <v:shape id="_x0000_i1029" type="#_x0000_t75" style="width:42.4pt;height:41.45pt" o:ole="">
                   <v:imagedata r:id="rId16" o:title=""/>
                 </v:shape>
-                <o:OLEObject Type="Embed" ProgID="Package" ShapeID="_x0000_i1057" DrawAspect="Content" ObjectID="_1847564826" r:id="rId17"/>
+                <o:OLEObject Type="Embed" ProgID="Package" ShapeID="_x0000_i1029" DrawAspect="Content" ObjectID="_1847635949" r:id="rId17"/>
               </w:object>
             </w:r>
           </w:p>
@@ -3816,10 +4214,10 @@
             </w:pPr>
             <w:r>
               <w:object w:dxaOrig="1371" w:dyaOrig="831" w14:anchorId="61974BEA">
-                <v:shape id="_x0000_i1059" type="#_x0000_t75" style="width:68.35pt;height:41.45pt" o:ole="">
+                <v:shape id="_x0000_i1030" type="#_x0000_t75" style="width:68.35pt;height:41.45pt" o:ole="">
                   <v:imagedata r:id="rId18" o:title=""/>
                 </v:shape>
-                <o:OLEObject Type="Embed" ProgID="Package" ShapeID="_x0000_i1059" DrawAspect="Content" ObjectID="_1847564827" r:id="rId19"/>
+                <o:OLEObject Type="Embed" ProgID="Package" ShapeID="_x0000_i1030" DrawAspect="Content" ObjectID="_1847635950" r:id="rId19"/>
               </w:object>
             </w:r>
           </w:p>
@@ -3866,10 +4264,10 @@
             </w:pPr>
             <w:r>
               <w:object w:dxaOrig="1071" w:dyaOrig="831" w14:anchorId="5AD932C3">
-                <v:shape id="_x0000_i1086" type="#_x0000_t75" style="width:53.75pt;height:41.45pt" o:ole="">
+                <v:shape id="_x0000_i1031" type="#_x0000_t75" style="width:53.75pt;height:41.45pt" o:ole="">
                   <v:imagedata r:id="rId10" o:title=""/>
                 </v:shape>
-                <o:OLEObject Type="Embed" ProgID="Package" ShapeID="_x0000_i1086" DrawAspect="Content" ObjectID="_1847564828" r:id="rId20"/>
+                <o:OLEObject Type="Embed" ProgID="Package" ShapeID="_x0000_i1031" DrawAspect="Content" ObjectID="_1847635951" r:id="rId20"/>
               </w:object>
             </w:r>
           </w:p>
@@ -3924,10 +4322,10 @@
             </w:pPr>
             <w:r>
               <w:object w:dxaOrig="850" w:dyaOrig="831" w14:anchorId="2A7F46DA">
-                <v:shape id="_x0000_i1088" type="#_x0000_t75" style="width:42.4pt;height:41.45pt" o:ole="">
+                <v:shape id="_x0000_i1032" type="#_x0000_t75" style="width:42.4pt;height:41.45pt" o:ole="">
                   <v:imagedata r:id="rId16" o:title=""/>
                 </v:shape>
-                <o:OLEObject Type="Embed" ProgID="Package" ShapeID="_x0000_i1088" DrawAspect="Content" ObjectID="_1847564829" r:id="rId21"/>
+                <o:OLEObject Type="Embed" ProgID="Package" ShapeID="_x0000_i1032" DrawAspect="Content" ObjectID="_1847635952" r:id="rId21"/>
               </w:object>
             </w:r>
           </w:p>
@@ -3974,10 +4372,10 @@
             </w:pPr>
             <w:r>
               <w:object w:dxaOrig="1380" w:dyaOrig="831" w14:anchorId="10369D6E">
-                <v:shape id="_x0000_i1112" type="#_x0000_t75" style="width:68.8pt;height:41.45pt" o:ole="">
+                <v:shape id="_x0000_i1033" type="#_x0000_t75" style="width:68.8pt;height:41.45pt" o:ole="">
                   <v:imagedata r:id="rId22" o:title=""/>
                 </v:shape>
-                <o:OLEObject Type="Embed" ProgID="Package" ShapeID="_x0000_i1112" DrawAspect="Content" ObjectID="_1847564830" r:id="rId23"/>
+                <o:OLEObject Type="Embed" ProgID="Package" ShapeID="_x0000_i1033" DrawAspect="Content" ObjectID="_1847635953" r:id="rId23"/>
               </w:object>
             </w:r>
           </w:p>
@@ -4024,10 +4422,10 @@
             </w:pPr>
             <w:r>
               <w:object w:dxaOrig="1051" w:dyaOrig="831" w14:anchorId="31DC145F">
-                <v:shape id="_x0000_i1090" type="#_x0000_t75" style="width:52.4pt;height:41.45pt" o:ole="">
+                <v:shape id="_x0000_i1034" type="#_x0000_t75" style="width:52.4pt;height:41.45pt" o:ole="">
                   <v:imagedata r:id="rId14" o:title=""/>
                 </v:shape>
-                <o:OLEObject Type="Embed" ProgID="Package" ShapeID="_x0000_i1090" DrawAspect="Content" ObjectID="_1847564831" r:id="rId24"/>
+                <o:OLEObject Type="Embed" ProgID="Package" ShapeID="_x0000_i1034" DrawAspect="Content" ObjectID="_1847635954" r:id="rId24"/>
               </w:object>
             </w:r>
           </w:p>
@@ -4074,18 +4472,18 @@
             </w:pPr>
             <w:r>
               <w:object w:dxaOrig="1071" w:dyaOrig="831" w14:anchorId="4E84C03F">
-                <v:shape id="_x0000_i1092" type="#_x0000_t75" style="width:53.75pt;height:41.45pt" o:ole="">
+                <v:shape id="_x0000_i1035" type="#_x0000_t75" style="width:53.75pt;height:41.45pt" o:ole="">
                   <v:imagedata r:id="rId10" o:title=""/>
                 </v:shape>
-                <o:OLEObject Type="Embed" ProgID="Package" ShapeID="_x0000_i1092" DrawAspect="Content" ObjectID="_1847564832" r:id="rId25"/>
+                <o:OLEObject Type="Embed" ProgID="Package" ShapeID="_x0000_i1035" DrawAspect="Content" ObjectID="_1847635955" r:id="rId25"/>
               </w:object>
             </w:r>
             <w:r>
               <w:object w:dxaOrig="1471" w:dyaOrig="831" w14:anchorId="67F5E209">
-                <v:shape id="_x0000_i1093" type="#_x0000_t75" style="width:73.35pt;height:41.45pt" o:ole="">
+                <v:shape id="_x0000_i1036" type="#_x0000_t75" style="width:73.35pt;height:41.45pt" o:ole="">
                   <v:imagedata r:id="rId26" o:title=""/>
                 </v:shape>
-                <o:OLEObject Type="Embed" ProgID="Package" ShapeID="_x0000_i1093" DrawAspect="Content" ObjectID="_1847564833" r:id="rId27"/>
+                <o:OLEObject Type="Embed" ProgID="Package" ShapeID="_x0000_i1036" DrawAspect="Content" ObjectID="_1847635956" r:id="rId27"/>
               </w:object>
             </w:r>
           </w:p>
@@ -4132,10 +4530,10 @@
             </w:pPr>
             <w:r>
               <w:object w:dxaOrig="850" w:dyaOrig="831" w14:anchorId="38F2E48B">
-                <v:shape id="_x0000_i1096" type="#_x0000_t75" style="width:42.4pt;height:41.45pt" o:ole="">
+                <v:shape id="_x0000_i1037" type="#_x0000_t75" style="width:42.4pt;height:41.45pt" o:ole="">
                   <v:imagedata r:id="rId16" o:title=""/>
                 </v:shape>
-                <o:OLEObject Type="Embed" ProgID="Package" ShapeID="_x0000_i1096" DrawAspect="Content" ObjectID="_1847564834" r:id="rId28"/>
+                <o:OLEObject Type="Embed" ProgID="Package" ShapeID="_x0000_i1037" DrawAspect="Content" ObjectID="_1847635957" r:id="rId28"/>
               </w:object>
             </w:r>
           </w:p>
@@ -4182,10 +4580,10 @@
             </w:pPr>
             <w:r>
               <w:object w:dxaOrig="1421" w:dyaOrig="831" w14:anchorId="37CD3988">
-                <v:shape id="_x0000_i1114" type="#_x0000_t75" style="width:71.1pt;height:41.45pt" o:ole="">
+                <v:shape id="_x0000_i1038" type="#_x0000_t75" style="width:71.1pt;height:41.45pt" o:ole="">
                   <v:imagedata r:id="rId29" o:title=""/>
                 </v:shape>
-                <o:OLEObject Type="Embed" ProgID="Package" ShapeID="_x0000_i1114" DrawAspect="Content" ObjectID="_1847564835" r:id="rId30"/>
+                <o:OLEObject Type="Embed" ProgID="Package" ShapeID="_x0000_i1038" DrawAspect="Content" ObjectID="_1847635958" r:id="rId30"/>
               </w:object>
             </w:r>
           </w:p>
@@ -4232,10 +4630,10 @@
             </w:pPr>
             <w:r>
               <w:object w:dxaOrig="2021" w:dyaOrig="831" w14:anchorId="18F43954">
-                <v:shape id="_x0000_i1116" type="#_x0000_t75" style="width:101.15pt;height:41.45pt" o:ole="">
+                <v:shape id="_x0000_i1039" type="#_x0000_t75" style="width:101.15pt;height:41.45pt" o:ole="">
                   <v:imagedata r:id="rId31" o:title=""/>
                 </v:shape>
-                <o:OLEObject Type="Embed" ProgID="Package" ShapeID="_x0000_i1116" DrawAspect="Content" ObjectID="_1847564836" r:id="rId32"/>
+                <o:OLEObject Type="Embed" ProgID="Package" ShapeID="_x0000_i1039" DrawAspect="Content" ObjectID="_1847635959" r:id="rId32"/>
               </w:object>
             </w:r>
           </w:p>
@@ -4282,10 +4680,10 @@
             </w:pPr>
             <w:r>
               <w:object w:dxaOrig="1561" w:dyaOrig="831" w14:anchorId="500A987E">
-                <v:shape id="_x0000_i1118" type="#_x0000_t75" style="width:77.9pt;height:41.45pt" o:ole="">
+                <v:shape id="_x0000_i1040" type="#_x0000_t75" style="width:77.9pt;height:41.45pt" o:ole="">
                   <v:imagedata r:id="rId33" o:title=""/>
                 </v:shape>
-                <o:OLEObject Type="Embed" ProgID="Package" ShapeID="_x0000_i1118" DrawAspect="Content" ObjectID="_1847564837" r:id="rId34"/>
+                <o:OLEObject Type="Embed" ProgID="Package" ShapeID="_x0000_i1040" DrawAspect="Content" ObjectID="_1847635960" r:id="rId34"/>
               </w:object>
             </w:r>
           </w:p>
@@ -4332,10 +4730,10 @@
             </w:pPr>
             <w:r>
               <w:object w:dxaOrig="1071" w:dyaOrig="831" w14:anchorId="1208A2F6">
-                <v:shape id="_x0000_i1098" type="#_x0000_t75" style="width:53.75pt;height:41.45pt" o:ole="">
+                <v:shape id="_x0000_i1041" type="#_x0000_t75" style="width:53.75pt;height:41.45pt" o:ole="">
                   <v:imagedata r:id="rId10" o:title=""/>
                 </v:shape>
-                <o:OLEObject Type="Embed" ProgID="Package" ShapeID="_x0000_i1098" DrawAspect="Content" ObjectID="_1847564838" r:id="rId35"/>
+                <o:OLEObject Type="Embed" ProgID="Package" ShapeID="_x0000_i1041" DrawAspect="Content" ObjectID="_1847635961" r:id="rId35"/>
               </w:object>
             </w:r>
           </w:p>
@@ -4383,10 +4781,10 @@
             </w:pPr>
             <w:r>
               <w:object w:dxaOrig="850" w:dyaOrig="831" w14:anchorId="2B02F829">
-                <v:shape id="_x0000_i1100" type="#_x0000_t75" style="width:42.4pt;height:41.45pt" o:ole="">
+                <v:shape id="_x0000_i1042" type="#_x0000_t75" style="width:42.4pt;height:41.45pt" o:ole="">
                   <v:imagedata r:id="rId16" o:title=""/>
                 </v:shape>
-                <o:OLEObject Type="Embed" ProgID="Package" ShapeID="_x0000_i1100" DrawAspect="Content" ObjectID="_1847564839" r:id="rId36"/>
+                <o:OLEObject Type="Embed" ProgID="Package" ShapeID="_x0000_i1042" DrawAspect="Content" ObjectID="_1847635962" r:id="rId36"/>
               </w:object>
             </w:r>
           </w:p>
@@ -4433,10 +4831,10 @@
             </w:pPr>
             <w:r>
               <w:object w:dxaOrig="1051" w:dyaOrig="831" w14:anchorId="7610A3F7">
-                <v:shape id="_x0000_i1101" type="#_x0000_t75" style="width:52.4pt;height:41.45pt" o:ole="">
+                <v:shape id="_x0000_i1043" type="#_x0000_t75" style="width:52.4pt;height:41.45pt" o:ole="">
                   <v:imagedata r:id="rId37" o:title=""/>
                 </v:shape>
-                <o:OLEObject Type="Embed" ProgID="Package" ShapeID="_x0000_i1101" DrawAspect="Content" ObjectID="_1847564840" r:id="rId38"/>
+                <o:OLEObject Type="Embed" ProgID="Package" ShapeID="_x0000_i1043" DrawAspect="Content" ObjectID="_1847635963" r:id="rId38"/>
               </w:object>
             </w:r>
           </w:p>
@@ -4483,10 +4881,10 @@
             </w:pPr>
             <w:r>
               <w:object w:dxaOrig="1731" w:dyaOrig="831" w14:anchorId="7A2C9C2F">
-                <v:shape id="_x0000_i1104" type="#_x0000_t75" style="width:86.6pt;height:41.45pt" o:ole="">
+                <v:shape id="_x0000_i1044" type="#_x0000_t75" style="width:86.6pt;height:41.45pt" o:ole="">
                   <v:imagedata r:id="rId39" o:title=""/>
                 </v:shape>
-                <o:OLEObject Type="Embed" ProgID="Package" ShapeID="_x0000_i1104" DrawAspect="Content" ObjectID="_1847564841" r:id="rId40"/>
+                <o:OLEObject Type="Embed" ProgID="Package" ShapeID="_x0000_i1044" DrawAspect="Content" ObjectID="_1847635964" r:id="rId40"/>
               </w:object>
             </w:r>
           </w:p>
@@ -4533,10 +4931,10 @@
             </w:pPr>
             <w:r>
               <w:object w:dxaOrig="1051" w:dyaOrig="831" w14:anchorId="2579DC9D">
-                <v:shape id="_x0000_i1106" type="#_x0000_t75" style="width:52.4pt;height:41.45pt" o:ole="">
+                <v:shape id="_x0000_i1045" type="#_x0000_t75" style="width:52.4pt;height:41.45pt" o:ole="">
                   <v:imagedata r:id="rId14" o:title=""/>
                 </v:shape>
-                <o:OLEObject Type="Embed" ProgID="Package" ShapeID="_x0000_i1106" DrawAspect="Content" ObjectID="_1847564842" r:id="rId41"/>
+                <o:OLEObject Type="Embed" ProgID="Package" ShapeID="_x0000_i1045" DrawAspect="Content" ObjectID="_1847635965" r:id="rId41"/>
               </w:object>
             </w:r>
           </w:p>
@@ -4583,18 +4981,18 @@
             </w:pPr>
             <w:r>
               <w:object w:dxaOrig="1071" w:dyaOrig="831" w14:anchorId="5E969F56">
-                <v:shape id="_x0000_i1107" type="#_x0000_t75" style="width:53.75pt;height:41.45pt" o:ole="">
+                <v:shape id="_x0000_i1046" type="#_x0000_t75" style="width:53.75pt;height:41.45pt" o:ole="">
                   <v:imagedata r:id="rId10" o:title=""/>
                 </v:shape>
-                <o:OLEObject Type="Embed" ProgID="Package" ShapeID="_x0000_i1107" DrawAspect="Content" ObjectID="_1847564843" r:id="rId42"/>
+                <o:OLEObject Type="Embed" ProgID="Package" ShapeID="_x0000_i1046" DrawAspect="Content" ObjectID="_1847635966" r:id="rId42"/>
               </w:object>
             </w:r>
             <w:r>
               <w:object w:dxaOrig="850" w:dyaOrig="831" w14:anchorId="0B2113BC">
-                <v:shape id="_x0000_i1108" type="#_x0000_t75" style="width:42.4pt;height:41.45pt" o:ole="">
+                <v:shape id="_x0000_i1047" type="#_x0000_t75" style="width:42.4pt;height:41.45pt" o:ole="">
                   <v:imagedata r:id="rId16" o:title=""/>
                 </v:shape>
-                <o:OLEObject Type="Embed" ProgID="Package" ShapeID="_x0000_i1108" DrawAspect="Content" ObjectID="_1847564844" r:id="rId43"/>
+                <o:OLEObject Type="Embed" ProgID="Package" ShapeID="_x0000_i1047" DrawAspect="Content" ObjectID="_1847635967" r:id="rId43"/>
               </w:object>
             </w:r>
           </w:p>
@@ -4641,10 +5039,10 @@
             </w:pPr>
             <w:r>
               <w:object w:dxaOrig="600" w:dyaOrig="831" w14:anchorId="497565F8">
-                <v:shape id="_x0000_i1120" type="#_x0000_t75" style="width:30.1pt;height:41.45pt" o:ole="">
+                <v:shape id="_x0000_i1048" type="#_x0000_t75" style="width:30.1pt;height:41.45pt" o:ole="">
                   <v:imagedata r:id="rId44" o:title=""/>
                 </v:shape>
-                <o:OLEObject Type="Embed" ProgID="Package" ShapeID="_x0000_i1120" DrawAspect="Content" ObjectID="_1847564845" r:id="rId45"/>
+                <o:OLEObject Type="Embed" ProgID="Package" ShapeID="_x0000_i1048" DrawAspect="Content" ObjectID="_1847635968" r:id="rId45"/>
               </w:object>
             </w:r>
           </w:p>
@@ -4675,12 +5073,12 @@
       <w:pPr>
         <w:pStyle w:val="Ttulo1"/>
       </w:pPr>
-      <w:bookmarkStart w:id="50" w:name="_Toc236851857"/>
+      <w:bookmarkStart w:id="55" w:name="_Toc237022984"/>
       <w:r>
         <w:lastRenderedPageBreak/>
         <w:t>PRUEBAS</w:t>
       </w:r>
-      <w:bookmarkEnd w:id="50"/>
+      <w:bookmarkEnd w:id="55"/>
     </w:p>
     <w:p/>
     <w:p>
@@ -4700,9 +5098,11 @@
       <w:pPr>
         <w:pStyle w:val="Ttulo2"/>
       </w:pPr>
+      <w:bookmarkStart w:id="56" w:name="_Toc237022985"/>
       <w:r>
         <w:t>Validación de datos</w:t>
       </w:r>
+      <w:bookmarkEnd w:id="56"/>
     </w:p>
     <w:p/>
     <w:p>
@@ -4743,7 +5143,7 @@
           <w:noProof/>
         </w:rPr>
         <w:drawing>
-          <wp:inline distT="0" distB="0" distL="0" distR="0" wp14:anchorId="6F58C4B8" wp14:editId="4A16062E">
+          <wp:inline distT="0" distB="0" distL="0" distR="0" wp14:anchorId="6F58C4B8" wp14:editId="2ED3686C">
             <wp:extent cx="5573210" cy="2745724"/>
             <wp:effectExtent l="0" t="0" r="0" b="0"/>
             <wp:docPr id="1414363135" name="Imagen 1"/>
@@ -4800,14 +5200,27 @@
       <w:r>
         <w:t xml:space="preserve">Ilustración </w:t>
       </w:r>
-      <w:fldSimple w:instr=" SEQ Ilustración \* ARABIC ">
-        <w:r>
-          <w:rPr>
-            <w:noProof/>
-          </w:rPr>
-          <w:t>1</w:t>
-        </w:r>
-      </w:fldSimple>
+      <w:r>
+        <w:fldChar w:fldCharType="begin"/>
+      </w:r>
+      <w:r>
+        <w:instrText xml:space="preserve"> SEQ Ilustración \* ARABIC </w:instrText>
+      </w:r>
+      <w:r>
+        <w:fldChar w:fldCharType="separate"/>
+      </w:r>
+      <w:r>
+        <w:rPr>
+          <w:noProof/>
+        </w:rPr>
+        <w:t>1</w:t>
+      </w:r>
+      <w:r>
+        <w:rPr>
+          <w:noProof/>
+        </w:rPr>
+        <w:fldChar w:fldCharType="end"/>
+      </w:r>
     </w:p>
     <w:p/>
     <w:p>
@@ -4854,7 +5267,7 @@
           <w:noProof/>
         </w:rPr>
         <w:drawing>
-          <wp:inline distT="0" distB="0" distL="0" distR="0" wp14:anchorId="572114AE" wp14:editId="792CE339">
+          <wp:inline distT="0" distB="0" distL="0" distR="0" wp14:anchorId="572114AE" wp14:editId="39DEAE59">
             <wp:extent cx="6018836" cy="2965269"/>
             <wp:effectExtent l="0" t="0" r="1270" b="6985"/>
             <wp:docPr id="1102922564" name="Imagen 2"/>
@@ -4910,14 +5323,27 @@
       <w:r>
         <w:t xml:space="preserve">Ilustración </w:t>
       </w:r>
-      <w:fldSimple w:instr=" SEQ Ilustración \* ARABIC ">
-        <w:r>
-          <w:rPr>
-            <w:noProof/>
-          </w:rPr>
-          <w:t>2</w:t>
-        </w:r>
-      </w:fldSimple>
+      <w:r>
+        <w:fldChar w:fldCharType="begin"/>
+      </w:r>
+      <w:r>
+        <w:instrText xml:space="preserve"> SEQ Ilustración \* ARABIC </w:instrText>
+      </w:r>
+      <w:r>
+        <w:fldChar w:fldCharType="separate"/>
+      </w:r>
+      <w:r>
+        <w:rPr>
+          <w:noProof/>
+        </w:rPr>
+        <w:t>2</w:t>
+      </w:r>
+      <w:r>
+        <w:rPr>
+          <w:noProof/>
+        </w:rPr>
+        <w:fldChar w:fldCharType="end"/>
+      </w:r>
     </w:p>
     <w:p/>
     <w:p>
@@ -4941,7 +5367,7 @@
           <w:noProof/>
         </w:rPr>
         <w:drawing>
-          <wp:inline distT="0" distB="0" distL="0" distR="0" wp14:anchorId="3D4DA317" wp14:editId="62F8ADB5">
+          <wp:inline distT="0" distB="0" distL="0" distR="0" wp14:anchorId="3D4DA317" wp14:editId="274C6C2C">
             <wp:extent cx="5937813" cy="2925351"/>
             <wp:effectExtent l="0" t="0" r="6350" b="8890"/>
             <wp:docPr id="318264717" name="Imagen 3"/>
@@ -4997,14 +5423,27 @@
       <w:r>
         <w:t xml:space="preserve">Ilustración </w:t>
       </w:r>
-      <w:fldSimple w:instr=" SEQ Ilustración \* ARABIC ">
-        <w:r>
-          <w:rPr>
-            <w:noProof/>
-          </w:rPr>
-          <w:t>3</w:t>
-        </w:r>
-      </w:fldSimple>
+      <w:r>
+        <w:fldChar w:fldCharType="begin"/>
+      </w:r>
+      <w:r>
+        <w:instrText xml:space="preserve"> SEQ Ilustración \* ARABIC </w:instrText>
+      </w:r>
+      <w:r>
+        <w:fldChar w:fldCharType="separate"/>
+      </w:r>
+      <w:r>
+        <w:rPr>
+          <w:noProof/>
+        </w:rPr>
+        <w:t>3</w:t>
+      </w:r>
+      <w:r>
+        <w:rPr>
+          <w:noProof/>
+        </w:rPr>
+        <w:fldChar w:fldCharType="end"/>
+      </w:r>
     </w:p>
     <w:p/>
     <w:p/>
@@ -5030,7 +5469,7 @@
           <w:noProof/>
         </w:rPr>
         <w:drawing>
-          <wp:inline distT="0" distB="0" distL="0" distR="0" wp14:anchorId="542D7D46" wp14:editId="6EC6FD84">
+          <wp:inline distT="0" distB="0" distL="0" distR="0" wp14:anchorId="542D7D46" wp14:editId="34E098A3">
             <wp:extent cx="5903089" cy="2908244"/>
             <wp:effectExtent l="0" t="0" r="2540" b="6985"/>
             <wp:docPr id="1873612886" name="Imagen 4"/>
@@ -5086,14 +5525,27 @@
       <w:r>
         <w:t xml:space="preserve">Ilustración </w:t>
       </w:r>
-      <w:fldSimple w:instr=" SEQ Ilustración \* ARABIC ">
-        <w:r>
-          <w:rPr>
-            <w:noProof/>
-          </w:rPr>
-          <w:t>4</w:t>
-        </w:r>
-      </w:fldSimple>
+      <w:r>
+        <w:fldChar w:fldCharType="begin"/>
+      </w:r>
+      <w:r>
+        <w:instrText xml:space="preserve"> SEQ Ilustración \* ARABIC </w:instrText>
+      </w:r>
+      <w:r>
+        <w:fldChar w:fldCharType="separate"/>
+      </w:r>
+      <w:r>
+        <w:rPr>
+          <w:noProof/>
+        </w:rPr>
+        <w:t>4</w:t>
+      </w:r>
+      <w:r>
+        <w:rPr>
+          <w:noProof/>
+        </w:rPr>
+        <w:fldChar w:fldCharType="end"/>
+      </w:r>
     </w:p>
     <w:p/>
     <w:p>
@@ -5117,7 +5569,7 @@
           <w:noProof/>
         </w:rPr>
         <w:drawing>
-          <wp:inline distT="0" distB="0" distL="0" distR="0" wp14:anchorId="2FE5FC78" wp14:editId="3F31A656">
+          <wp:inline distT="0" distB="0" distL="0" distR="0" wp14:anchorId="2FE5FC78" wp14:editId="343A1FBE">
             <wp:extent cx="5978324" cy="2945309"/>
             <wp:effectExtent l="0" t="0" r="3810" b="7620"/>
             <wp:docPr id="1564779611" name="Imagen 5"/>
@@ -5173,14 +5625,27 @@
       <w:r>
         <w:t xml:space="preserve">Ilustración </w:t>
       </w:r>
-      <w:fldSimple w:instr=" SEQ Ilustración \* ARABIC ">
-        <w:r>
-          <w:rPr>
-            <w:noProof/>
-          </w:rPr>
-          <w:t>5</w:t>
-        </w:r>
-      </w:fldSimple>
+      <w:r>
+        <w:fldChar w:fldCharType="begin"/>
+      </w:r>
+      <w:r>
+        <w:instrText xml:space="preserve"> SEQ Ilustración \* ARABIC </w:instrText>
+      </w:r>
+      <w:r>
+        <w:fldChar w:fldCharType="separate"/>
+      </w:r>
+      <w:r>
+        <w:rPr>
+          <w:noProof/>
+        </w:rPr>
+        <w:t>5</w:t>
+      </w:r>
+      <w:r>
+        <w:rPr>
+          <w:noProof/>
+        </w:rPr>
+        <w:fldChar w:fldCharType="end"/>
+      </w:r>
     </w:p>
     <w:p/>
     <w:p/>
@@ -5188,10 +5653,12 @@
       <w:pPr>
         <w:pStyle w:val="Ttulo2"/>
       </w:pPr>
+      <w:bookmarkStart w:id="57" w:name="_Toc237022986"/>
       <w:r>
         <w:lastRenderedPageBreak/>
         <w:t>Pruebas de Control de acceso</w:t>
       </w:r>
+      <w:bookmarkEnd w:id="57"/>
     </w:p>
     <w:p/>
     <w:p>
@@ -5234,7 +5701,7 @@
           <w:noProof/>
         </w:rPr>
         <w:drawing>
-          <wp:inline distT="0" distB="0" distL="0" distR="0" wp14:anchorId="2FBD4170" wp14:editId="60949554">
+          <wp:inline distT="0" distB="0" distL="0" distR="0" wp14:anchorId="2FBD4170" wp14:editId="109EB95F">
             <wp:extent cx="5723681" cy="2819856"/>
             <wp:effectExtent l="0" t="0" r="0" b="0"/>
             <wp:docPr id="1219651955" name="Imagen 6"/>
@@ -5332,7 +5799,7 @@
           <w:noProof/>
         </w:rPr>
         <w:drawing>
-          <wp:inline distT="0" distB="0" distL="0" distR="0" wp14:anchorId="5DA69D45" wp14:editId="765972C3">
+          <wp:inline distT="0" distB="0" distL="0" distR="0" wp14:anchorId="5DA69D45" wp14:editId="089D2B9C">
             <wp:extent cx="5937813" cy="2925351"/>
             <wp:effectExtent l="0" t="0" r="6350" b="8890"/>
             <wp:docPr id="1012142530" name="Imagen 7"/>
@@ -5386,9 +5853,11 @@
       <w:pPr>
         <w:pStyle w:val="Ttulo2"/>
       </w:pPr>
+      <w:bookmarkStart w:id="58" w:name="_Toc237022987"/>
       <w:r>
         <w:t>Pruebas funcionales</w:t>
       </w:r>
+      <w:bookmarkEnd w:id="58"/>
     </w:p>
     <w:p/>
     <w:p>
@@ -5429,7 +5898,7 @@
           <w:noProof/>
         </w:rPr>
         <w:drawing>
-          <wp:inline distT="0" distB="0" distL="0" distR="0" wp14:anchorId="002DD627" wp14:editId="15804EBD">
+          <wp:inline distT="0" distB="0" distL="0" distR="0" wp14:anchorId="002DD627" wp14:editId="3A6D27D0">
             <wp:extent cx="4710552" cy="2320724"/>
             <wp:effectExtent l="0" t="0" r="0" b="3810"/>
             <wp:docPr id="96298346" name="Imagen 9"/>
@@ -5486,14 +5955,27 @@
       <w:r>
         <w:t xml:space="preserve">Ilustración </w:t>
       </w:r>
-      <w:fldSimple w:instr=" SEQ Ilustración \* ARABIC ">
-        <w:r>
-          <w:rPr>
-            <w:noProof/>
-          </w:rPr>
-          <w:t>6</w:t>
-        </w:r>
-      </w:fldSimple>
+      <w:r>
+        <w:fldChar w:fldCharType="begin"/>
+      </w:r>
+      <w:r>
+        <w:instrText xml:space="preserve"> SEQ Ilustración \* ARABIC </w:instrText>
+      </w:r>
+      <w:r>
+        <w:fldChar w:fldCharType="separate"/>
+      </w:r>
+      <w:r>
+        <w:rPr>
+          <w:noProof/>
+        </w:rPr>
+        <w:t>6</w:t>
+      </w:r>
+      <w:r>
+        <w:rPr>
+          <w:noProof/>
+        </w:rPr>
+        <w:fldChar w:fldCharType="end"/>
+      </w:r>
     </w:p>
     <w:p>
       <w:pPr>
@@ -5521,7 +6003,7 @@
           <w:noProof/>
         </w:rPr>
         <w:drawing>
-          <wp:inline distT="0" distB="0" distL="0" distR="0" wp14:anchorId="3049E3F1" wp14:editId="4D035FD5">
+          <wp:inline distT="0" distB="0" distL="0" distR="0" wp14:anchorId="3049E3F1" wp14:editId="1BB2EE50">
             <wp:extent cx="5121798" cy="2523330"/>
             <wp:effectExtent l="0" t="0" r="3175" b="0"/>
             <wp:docPr id="306066052" name="Imagen 10"/>
@@ -5578,14 +6060,27 @@
       <w:r>
         <w:t xml:space="preserve">Ilustración </w:t>
       </w:r>
-      <w:fldSimple w:instr=" SEQ Ilustración \* ARABIC ">
-        <w:r>
-          <w:rPr>
-            <w:noProof/>
-          </w:rPr>
-          <w:t>7</w:t>
-        </w:r>
-      </w:fldSimple>
+      <w:r>
+        <w:fldChar w:fldCharType="begin"/>
+      </w:r>
+      <w:r>
+        <w:instrText xml:space="preserve"> SEQ Ilustración \* ARABIC </w:instrText>
+      </w:r>
+      <w:r>
+        <w:fldChar w:fldCharType="separate"/>
+      </w:r>
+      <w:r>
+        <w:rPr>
+          <w:noProof/>
+        </w:rPr>
+        <w:t>7</w:t>
+      </w:r>
+      <w:r>
+        <w:rPr>
+          <w:noProof/>
+        </w:rPr>
+        <w:fldChar w:fldCharType="end"/>
+      </w:r>
     </w:p>
     <w:p>
       <w:pPr>
@@ -5612,7 +6107,7 @@
           <w:noProof/>
         </w:rPr>
         <w:drawing>
-          <wp:inline distT="0" distB="0" distL="0" distR="0" wp14:anchorId="3A3EF449" wp14:editId="2CF4F90E">
+          <wp:inline distT="0" distB="0" distL="0" distR="0" wp14:anchorId="3A3EF449" wp14:editId="32B9C478">
             <wp:extent cx="5192183" cy="2558006"/>
             <wp:effectExtent l="0" t="0" r="8890" b="0"/>
             <wp:docPr id="1629444803" name="Imagen 11"/>
@@ -5669,14 +6164,27 @@
       <w:r>
         <w:t xml:space="preserve">Ilustración </w:t>
       </w:r>
-      <w:fldSimple w:instr=" SEQ Ilustración \* ARABIC ">
-        <w:r>
-          <w:rPr>
-            <w:noProof/>
-          </w:rPr>
-          <w:t>8</w:t>
-        </w:r>
-      </w:fldSimple>
+      <w:r>
+        <w:fldChar w:fldCharType="begin"/>
+      </w:r>
+      <w:r>
+        <w:instrText xml:space="preserve"> SEQ Ilustración \* ARABIC </w:instrText>
+      </w:r>
+      <w:r>
+        <w:fldChar w:fldCharType="separate"/>
+      </w:r>
+      <w:r>
+        <w:rPr>
+          <w:noProof/>
+        </w:rPr>
+        <w:t>8</w:t>
+      </w:r>
+      <w:r>
+        <w:rPr>
+          <w:noProof/>
+        </w:rPr>
+        <w:fldChar w:fldCharType="end"/>
+      </w:r>
     </w:p>
     <w:p>
       <w:pPr>
@@ -5720,7 +6228,7 @@
           <w:noProof/>
         </w:rPr>
         <w:drawing>
-          <wp:inline distT="0" distB="0" distL="0" distR="0" wp14:anchorId="11B44020" wp14:editId="6D994B91">
+          <wp:inline distT="0" distB="0" distL="0" distR="0" wp14:anchorId="11B44020" wp14:editId="19176CE8">
             <wp:extent cx="5388015" cy="2654485"/>
             <wp:effectExtent l="0" t="0" r="3175" b="0"/>
             <wp:docPr id="699447593" name="Imagen 12"/>
@@ -5777,14 +6285,27 @@
       <w:r>
         <w:t xml:space="preserve">Ilustración </w:t>
       </w:r>
-      <w:fldSimple w:instr=" SEQ Ilustración \* ARABIC ">
-        <w:r>
-          <w:rPr>
-            <w:noProof/>
-          </w:rPr>
-          <w:t>9</w:t>
-        </w:r>
-      </w:fldSimple>
+      <w:r>
+        <w:fldChar w:fldCharType="begin"/>
+      </w:r>
+      <w:r>
+        <w:instrText xml:space="preserve"> SEQ Ilustración \* ARABIC </w:instrText>
+      </w:r>
+      <w:r>
+        <w:fldChar w:fldCharType="separate"/>
+      </w:r>
+      <w:r>
+        <w:rPr>
+          <w:noProof/>
+        </w:rPr>
+        <w:t>9</w:t>
+      </w:r>
+      <w:r>
+        <w:rPr>
+          <w:noProof/>
+        </w:rPr>
+        <w:fldChar w:fldCharType="end"/>
+      </w:r>
     </w:p>
     <w:p>
       <w:pPr>
@@ -5810,7 +6331,7 @@
           <w:noProof/>
         </w:rPr>
         <w:drawing>
-          <wp:inline distT="0" distB="0" distL="0" distR="0" wp14:anchorId="3435070E" wp14:editId="4B008273">
+          <wp:inline distT="0" distB="0" distL="0" distR="0" wp14:anchorId="3435070E" wp14:editId="4C88043D">
             <wp:extent cx="5578998" cy="2748576"/>
             <wp:effectExtent l="0" t="0" r="3175" b="0"/>
             <wp:docPr id="1411725248" name="Imagen 13"/>
@@ -5866,14 +6387,27 @@
       <w:r>
         <w:t xml:space="preserve">Ilustración </w:t>
       </w:r>
-      <w:fldSimple w:instr=" SEQ Ilustración \* ARABIC ">
-        <w:r>
-          <w:rPr>
-            <w:noProof/>
-          </w:rPr>
-          <w:t>10</w:t>
-        </w:r>
-      </w:fldSimple>
+      <w:r>
+        <w:fldChar w:fldCharType="begin"/>
+      </w:r>
+      <w:r>
+        <w:instrText xml:space="preserve"> SEQ Ilustración \* ARABIC </w:instrText>
+      </w:r>
+      <w:r>
+        <w:fldChar w:fldCharType="separate"/>
+      </w:r>
+      <w:r>
+        <w:rPr>
+          <w:noProof/>
+        </w:rPr>
+        <w:t>10</w:t>
+      </w:r>
+      <w:r>
+        <w:rPr>
+          <w:noProof/>
+        </w:rPr>
+        <w:fldChar w:fldCharType="end"/>
+      </w:r>
     </w:p>
     <w:p>
       <w:pPr>
@@ -5894,10 +6428,12 @@
       <w:pPr>
         <w:pStyle w:val="Ttulo2"/>
       </w:pPr>
+      <w:bookmarkStart w:id="59" w:name="_Toc237022988"/>
       <w:r>
         <w:lastRenderedPageBreak/>
         <w:t>Pruebas de Carga de datos</w:t>
       </w:r>
+      <w:bookmarkEnd w:id="59"/>
     </w:p>
     <w:p/>
     <w:p>
@@ -5939,7 +6475,13 @@
       </w:r>
       <w:proofErr w:type="spellStart"/>
       <w:r>
-        <w:t>método_pago</w:t>
+        <w:t>m</w:t>
+      </w:r>
+      <w:r>
+        <w:t>e</w:t>
+      </w:r>
+      <w:r>
+        <w:t>todo_pago</w:t>
       </w:r>
       <w:proofErr w:type="spellEnd"/>
       <w:r>
@@ -5959,7 +6501,7 @@
           <w:noProof/>
         </w:rPr>
         <w:drawing>
-          <wp:inline distT="0" distB="0" distL="0" distR="0" wp14:anchorId="3F8CC8A5" wp14:editId="6CB3DBB4">
+          <wp:inline distT="0" distB="0" distL="0" distR="0" wp14:anchorId="3F8CC8A5" wp14:editId="7A8B494D">
             <wp:extent cx="3379808" cy="2414741"/>
             <wp:effectExtent l="0" t="0" r="0" b="5080"/>
             <wp:docPr id="1319690839" name="Imagen 14"/>
@@ -6021,14 +6563,27 @@
       <w:r>
         <w:t xml:space="preserve">Ilustración </w:t>
       </w:r>
-      <w:fldSimple w:instr=" SEQ Ilustración \* ARABIC ">
-        <w:r>
-          <w:rPr>
-            <w:noProof/>
-          </w:rPr>
-          <w:t>11</w:t>
-        </w:r>
-      </w:fldSimple>
+      <w:r>
+        <w:fldChar w:fldCharType="begin"/>
+      </w:r>
+      <w:r>
+        <w:instrText xml:space="preserve"> SEQ Ilustración \* ARABIC </w:instrText>
+      </w:r>
+      <w:r>
+        <w:fldChar w:fldCharType="separate"/>
+      </w:r>
+      <w:r>
+        <w:rPr>
+          <w:noProof/>
+        </w:rPr>
+        <w:t>11</w:t>
+      </w:r>
+      <w:r>
+        <w:rPr>
+          <w:noProof/>
+        </w:rPr>
+        <w:fldChar w:fldCharType="end"/>
+      </w:r>
     </w:p>
     <w:p>
       <w:pPr>
@@ -6040,7 +6595,7 @@
           <w:noProof/>
         </w:rPr>
         <w:drawing>
-          <wp:inline distT="0" distB="0" distL="0" distR="0" wp14:anchorId="16D6DC01" wp14:editId="24FBD8AB">
+          <wp:inline distT="0" distB="0" distL="0" distR="0" wp14:anchorId="16D6DC01" wp14:editId="01C1955A">
             <wp:extent cx="5162309" cy="2543288"/>
             <wp:effectExtent l="0" t="0" r="635" b="0"/>
             <wp:docPr id="1456840530" name="Imagen 15"/>
@@ -6097,14 +6652,27 @@
       <w:r>
         <w:t xml:space="preserve">Ilustración </w:t>
       </w:r>
-      <w:fldSimple w:instr=" SEQ Ilustración \* ARABIC ">
-        <w:r>
-          <w:rPr>
-            <w:noProof/>
-          </w:rPr>
-          <w:t>12</w:t>
-        </w:r>
-      </w:fldSimple>
+      <w:r>
+        <w:fldChar w:fldCharType="begin"/>
+      </w:r>
+      <w:r>
+        <w:instrText xml:space="preserve"> SEQ Ilustración \* ARABIC </w:instrText>
+      </w:r>
+      <w:r>
+        <w:fldChar w:fldCharType="separate"/>
+      </w:r>
+      <w:r>
+        <w:rPr>
+          <w:noProof/>
+        </w:rPr>
+        <w:t>12</w:t>
+      </w:r>
+      <w:r>
+        <w:rPr>
+          <w:noProof/>
+        </w:rPr>
+        <w:fldChar w:fldCharType="end"/>
+      </w:r>
     </w:p>
     <w:p>
       <w:pPr>
@@ -6220,14 +6788,27 @@
       <w:r>
         <w:t xml:space="preserve">Ilustración </w:t>
       </w:r>
-      <w:fldSimple w:instr=" SEQ Ilustración \* ARABIC ">
-        <w:r>
-          <w:rPr>
-            <w:noProof/>
-          </w:rPr>
-          <w:t>13</w:t>
-        </w:r>
-      </w:fldSimple>
+      <w:r>
+        <w:fldChar w:fldCharType="begin"/>
+      </w:r>
+      <w:r>
+        <w:instrText xml:space="preserve"> SEQ Ilustración \* ARABIC </w:instrText>
+      </w:r>
+      <w:r>
+        <w:fldChar w:fldCharType="separate"/>
+      </w:r>
+      <w:r>
+        <w:rPr>
+          <w:noProof/>
+        </w:rPr>
+        <w:t>13</w:t>
+      </w:r>
+      <w:r>
+        <w:rPr>
+          <w:noProof/>
+        </w:rPr>
+        <w:fldChar w:fldCharType="end"/>
+      </w:r>
     </w:p>
     <w:p>
       <w:pPr>
@@ -6239,7 +6820,7 @@
           <w:noProof/>
         </w:rPr>
         <w:drawing>
-          <wp:inline distT="0" distB="0" distL="0" distR="0" wp14:anchorId="53382059" wp14:editId="353DF564">
+          <wp:inline distT="0" distB="0" distL="0" distR="0" wp14:anchorId="53382059" wp14:editId="50C07126">
             <wp:extent cx="5579833" cy="2748987"/>
             <wp:effectExtent l="0" t="0" r="1905" b="0"/>
             <wp:docPr id="879965489" name="Imagen 17"/>
@@ -6296,14 +6877,27 @@
       <w:r>
         <w:t xml:space="preserve">Ilustración </w:t>
       </w:r>
-      <w:fldSimple w:instr=" SEQ Ilustración \* ARABIC ">
-        <w:r>
-          <w:rPr>
-            <w:noProof/>
-          </w:rPr>
-          <w:t>14</w:t>
-        </w:r>
-      </w:fldSimple>
+      <w:r>
+        <w:fldChar w:fldCharType="begin"/>
+      </w:r>
+      <w:r>
+        <w:instrText xml:space="preserve"> SEQ Ilustración \* ARABIC </w:instrText>
+      </w:r>
+      <w:r>
+        <w:fldChar w:fldCharType="separate"/>
+      </w:r>
+      <w:r>
+        <w:rPr>
+          <w:noProof/>
+        </w:rPr>
+        <w:t>14</w:t>
+      </w:r>
+      <w:r>
+        <w:rPr>
+          <w:noProof/>
+        </w:rPr>
+        <w:fldChar w:fldCharType="end"/>
+      </w:r>
     </w:p>
     <w:p>
       <w:pPr>
@@ -6468,14 +7062,27 @@
       <w:r>
         <w:t xml:space="preserve">Ilustración </w:t>
       </w:r>
-      <w:fldSimple w:instr=" SEQ Ilustración \* ARABIC ">
-        <w:r>
-          <w:rPr>
-            <w:noProof/>
-          </w:rPr>
-          <w:t>15</w:t>
-        </w:r>
-      </w:fldSimple>
+      <w:r>
+        <w:fldChar w:fldCharType="begin"/>
+      </w:r>
+      <w:r>
+        <w:instrText xml:space="preserve"> SEQ Ilustración \* ARABIC </w:instrText>
+      </w:r>
+      <w:r>
+        <w:fldChar w:fldCharType="separate"/>
+      </w:r>
+      <w:r>
+        <w:rPr>
+          <w:noProof/>
+        </w:rPr>
+        <w:t>15</w:t>
+      </w:r>
+      <w:r>
+        <w:rPr>
+          <w:noProof/>
+        </w:rPr>
+        <w:fldChar w:fldCharType="end"/>
+      </w:r>
     </w:p>
     <w:p>
       <w:pPr>
@@ -6487,7 +7094,7 @@
           <w:noProof/>
         </w:rPr>
         <w:drawing>
-          <wp:inline distT="0" distB="0" distL="0" distR="0" wp14:anchorId="77AEDBA2" wp14:editId="78AD8E6D">
+          <wp:inline distT="0" distB="0" distL="0" distR="0" wp14:anchorId="77AEDBA2" wp14:editId="75942E48">
             <wp:extent cx="5735256" cy="2825559"/>
             <wp:effectExtent l="0" t="0" r="0" b="0"/>
             <wp:docPr id="2047169737" name="Imagen 19"/>
@@ -6544,14 +7151,27 @@
       <w:r>
         <w:t xml:space="preserve">Ilustración </w:t>
       </w:r>
-      <w:fldSimple w:instr=" SEQ Ilustración \* ARABIC ">
-        <w:r>
-          <w:rPr>
-            <w:noProof/>
-          </w:rPr>
-          <w:t>16</w:t>
-        </w:r>
-      </w:fldSimple>
+      <w:r>
+        <w:fldChar w:fldCharType="begin"/>
+      </w:r>
+      <w:r>
+        <w:instrText xml:space="preserve"> SEQ Ilustración \* ARABIC </w:instrText>
+      </w:r>
+      <w:r>
+        <w:fldChar w:fldCharType="separate"/>
+      </w:r>
+      <w:r>
+        <w:rPr>
+          <w:noProof/>
+        </w:rPr>
+        <w:t>16</w:t>
+      </w:r>
+      <w:r>
+        <w:rPr>
+          <w:noProof/>
+        </w:rPr>
+        <w:fldChar w:fldCharType="end"/>
+      </w:r>
     </w:p>
     <w:p/>
     <w:p/>
@@ -6559,10 +7179,12 @@
       <w:pPr>
         <w:pStyle w:val="Ttulo2"/>
       </w:pPr>
+      <w:bookmarkStart w:id="60" w:name="_Toc237022989"/>
       <w:r>
         <w:lastRenderedPageBreak/>
         <w:t>Pruebas de Seguridad</w:t>
       </w:r>
+      <w:bookmarkEnd w:id="60"/>
     </w:p>
     <w:p/>
     <w:p>
@@ -6650,14 +7272,27 @@
       <w:r>
         <w:t xml:space="preserve">Ilustración </w:t>
       </w:r>
-      <w:fldSimple w:instr=" SEQ Ilustración \* ARABIC ">
-        <w:r>
-          <w:rPr>
-            <w:noProof/>
-          </w:rPr>
-          <w:t>17</w:t>
-        </w:r>
-      </w:fldSimple>
+      <w:r>
+        <w:fldChar w:fldCharType="begin"/>
+      </w:r>
+      <w:r>
+        <w:instrText xml:space="preserve"> SEQ Ilustración \* ARABIC </w:instrText>
+      </w:r>
+      <w:r>
+        <w:fldChar w:fldCharType="separate"/>
+      </w:r>
+      <w:r>
+        <w:rPr>
+          <w:noProof/>
+        </w:rPr>
+        <w:t>17</w:t>
+      </w:r>
+      <w:r>
+        <w:rPr>
+          <w:noProof/>
+        </w:rPr>
+        <w:fldChar w:fldCharType="end"/>
+      </w:r>
     </w:p>
     <w:p>
       <w:r>
@@ -6736,14 +7371,27 @@
       <w:r>
         <w:t xml:space="preserve">Ilustración </w:t>
       </w:r>
-      <w:fldSimple w:instr=" SEQ Ilustración \* ARABIC ">
-        <w:r>
-          <w:rPr>
-            <w:noProof/>
-          </w:rPr>
-          <w:t>18</w:t>
-        </w:r>
-      </w:fldSimple>
+      <w:r>
+        <w:fldChar w:fldCharType="begin"/>
+      </w:r>
+      <w:r>
+        <w:instrText xml:space="preserve"> SEQ Ilustración \* ARABIC </w:instrText>
+      </w:r>
+      <w:r>
+        <w:fldChar w:fldCharType="separate"/>
+      </w:r>
+      <w:r>
+        <w:rPr>
+          <w:noProof/>
+        </w:rPr>
+        <w:t>18</w:t>
+      </w:r>
+      <w:r>
+        <w:rPr>
+          <w:noProof/>
+        </w:rPr>
+        <w:fldChar w:fldCharType="end"/>
+      </w:r>
     </w:p>
     <w:p>
       <w:r>
@@ -6767,7 +7415,7 @@
           <w:noProof/>
         </w:rPr>
         <w:drawing>
-          <wp:inline distT="0" distB="0" distL="0" distR="0" wp14:anchorId="15A6B166" wp14:editId="6F144BD1">
+          <wp:inline distT="0" distB="0" distL="0" distR="0" wp14:anchorId="15A6B166" wp14:editId="3C35C35A">
             <wp:extent cx="6249414" cy="3078866"/>
             <wp:effectExtent l="0" t="0" r="0" b="7620"/>
             <wp:docPr id="542771488" name="Imagen 24"/>
@@ -6823,14 +7471,27 @@
       <w:r>
         <w:t xml:space="preserve">Ilustración </w:t>
       </w:r>
-      <w:fldSimple w:instr=" SEQ Ilustración \* ARABIC ">
-        <w:r>
-          <w:rPr>
-            <w:noProof/>
-          </w:rPr>
-          <w:t>19</w:t>
-        </w:r>
-      </w:fldSimple>
+      <w:r>
+        <w:fldChar w:fldCharType="begin"/>
+      </w:r>
+      <w:r>
+        <w:instrText xml:space="preserve"> SEQ Ilustración \* ARABIC </w:instrText>
+      </w:r>
+      <w:r>
+        <w:fldChar w:fldCharType="separate"/>
+      </w:r>
+      <w:r>
+        <w:rPr>
+          <w:noProof/>
+        </w:rPr>
+        <w:t>19</w:t>
+      </w:r>
+      <w:r>
+        <w:rPr>
+          <w:noProof/>
+        </w:rPr>
+        <w:fldChar w:fldCharType="end"/>
+      </w:r>
     </w:p>
     <w:p>
       <w:r>
@@ -6853,7 +7514,7 @@
           <w:noProof/>
         </w:rPr>
         <w:drawing>
-          <wp:inline distT="0" distB="0" distL="0" distR="0" wp14:anchorId="1C8F7996" wp14:editId="6E16785C">
+          <wp:inline distT="0" distB="0" distL="0" distR="0" wp14:anchorId="1C8F7996" wp14:editId="1B5F9076">
             <wp:extent cx="6290841" cy="3099276"/>
             <wp:effectExtent l="0" t="0" r="0" b="6350"/>
             <wp:docPr id="1028589689" name="Imagen 25"/>
@@ -6909,14 +7570,27 @@
       <w:r>
         <w:t xml:space="preserve">Ilustración </w:t>
       </w:r>
-      <w:fldSimple w:instr=" SEQ Ilustración \* ARABIC ">
-        <w:r>
-          <w:rPr>
-            <w:noProof/>
-          </w:rPr>
-          <w:t>20</w:t>
-        </w:r>
-      </w:fldSimple>
+      <w:r>
+        <w:fldChar w:fldCharType="begin"/>
+      </w:r>
+      <w:r>
+        <w:instrText xml:space="preserve"> SEQ Ilustración \* ARABIC </w:instrText>
+      </w:r>
+      <w:r>
+        <w:fldChar w:fldCharType="separate"/>
+      </w:r>
+      <w:r>
+        <w:rPr>
+          <w:noProof/>
+        </w:rPr>
+        <w:t>20</w:t>
+      </w:r>
+      <w:r>
+        <w:rPr>
+          <w:noProof/>
+        </w:rPr>
+        <w:fldChar w:fldCharType="end"/>
+      </w:r>
     </w:p>
     <w:p>
       <w:pPr>
@@ -7017,24 +7691,37 @@
       <w:r>
         <w:t xml:space="preserve">Ilustración </w:t>
       </w:r>
-      <w:fldSimple w:instr=" SEQ Ilustración \* ARABIC ">
-        <w:r>
-          <w:rPr>
-            <w:noProof/>
-          </w:rPr>
-          <w:t>21</w:t>
-        </w:r>
-      </w:fldSimple>
+      <w:r>
+        <w:fldChar w:fldCharType="begin"/>
+      </w:r>
+      <w:r>
+        <w:instrText xml:space="preserve"> SEQ Ilustración \* ARABIC </w:instrText>
+      </w:r>
+      <w:r>
+        <w:fldChar w:fldCharType="separate"/>
+      </w:r>
+      <w:r>
+        <w:rPr>
+          <w:noProof/>
+        </w:rPr>
+        <w:t>21</w:t>
+      </w:r>
+      <w:r>
+        <w:rPr>
+          <w:noProof/>
+        </w:rPr>
+        <w:fldChar w:fldCharType="end"/>
+      </w:r>
     </w:p>
     <w:p>
       <w:pPr>
         <w:pStyle w:val="Ttulo1"/>
       </w:pPr>
-      <w:bookmarkStart w:id="51" w:name="_Toc236851858"/>
+      <w:bookmarkStart w:id="61" w:name="_Toc237022990"/>
       <w:r>
         <w:t>BITÁCORA DE PROGRAMACION Y PRUEBAS</w:t>
       </w:r>
-      <w:bookmarkEnd w:id="51"/>
+      <w:bookmarkEnd w:id="61"/>
     </w:p>
     <w:p/>
     <w:tbl>
@@ -7377,18 +8064,13 @@
           </w:tcPr>
           <w:p>
             <w:r>
-              <w:t xml:space="preserve">Limpieza del repositorio </w:t>
-            </w:r>
-            <w:proofErr w:type="gramStart"/>
-            <w:r>
-              <w:t>y .</w:t>
+              <w:t>Limpieza del repositorio y .</w:t>
             </w:r>
             <w:proofErr w:type="spellStart"/>
             <w:r>
               <w:t>gitignore</w:t>
             </w:r>
             <w:proofErr w:type="spellEnd"/>
-            <w:proofErr w:type="gramEnd"/>
             <w:r>
               <w:t>; implementación de RF-004 (seguridad, auditoria y permisos)</w:t>
             </w:r>
@@ -8159,36 +8841,1405 @@
       <w:pPr>
         <w:pStyle w:val="Ttulo1"/>
       </w:pPr>
-      <w:bookmarkStart w:id="52" w:name="_Toc236851859"/>
+      <w:bookmarkStart w:id="62" w:name="_Toc237022991"/>
       <w:r>
         <w:t>BIBLIOGRAFIA</w:t>
       </w:r>
-      <w:bookmarkEnd w:id="52"/>
+      <w:bookmarkEnd w:id="62"/>
+    </w:p>
+    <w:p/>
+    <w:p>
+      <w:pPr>
+        <w:pStyle w:val="PARRAFOENTREGABLES"/>
+        <w:ind w:left="357" w:hanging="357"/>
+        <w:rPr>
+          <w:szCs w:val="24"/>
+        </w:rPr>
+      </w:pPr>
+      <w:r>
+        <w:rPr>
+          <w:szCs w:val="24"/>
+        </w:rPr>
+        <w:t xml:space="preserve">Bootstrap Team. (s.f.). Bootstrap </w:t>
+      </w:r>
+      <w:proofErr w:type="spellStart"/>
+      <w:r>
+        <w:rPr>
+          <w:szCs w:val="24"/>
+        </w:rPr>
+        <w:t>documentation</w:t>
+      </w:r>
+      <w:proofErr w:type="spellEnd"/>
+      <w:r>
+        <w:rPr>
+          <w:szCs w:val="24"/>
+        </w:rPr>
+        <w:t xml:space="preserve"> (v5.0). Recuperado de https://getbootstrap.com/docs/5.0/</w:t>
+      </w:r>
+    </w:p>
+    <w:p>
+      <w:pPr>
+        <w:pStyle w:val="PARRAFOENTREGABLES"/>
+        <w:ind w:left="357" w:hanging="357"/>
+        <w:rPr>
+          <w:szCs w:val="24"/>
+        </w:rPr>
+      </w:pPr>
+      <w:r>
+        <w:rPr>
+          <w:szCs w:val="24"/>
+        </w:rPr>
+        <w:t xml:space="preserve">Cloudflare, Inc. (s.f.). Cloudflare Tunnel </w:t>
+      </w:r>
+      <w:proofErr w:type="spellStart"/>
+      <w:r>
+        <w:rPr>
+          <w:szCs w:val="24"/>
+        </w:rPr>
+        <w:t>documentation</w:t>
+      </w:r>
+      <w:proofErr w:type="spellEnd"/>
+      <w:r>
+        <w:rPr>
+          <w:szCs w:val="24"/>
+        </w:rPr>
+        <w:t>. Recuperado de https://developers.cloudflare.com/cloudflare-one/connections/connect-networks/get-started/tunnel-guide/</w:t>
+      </w:r>
+    </w:p>
+    <w:p>
+      <w:pPr>
+        <w:pStyle w:val="PARRAFOENTREGABLES"/>
+        <w:ind w:left="357" w:hanging="357"/>
+        <w:rPr>
+          <w:szCs w:val="24"/>
+        </w:rPr>
+      </w:pPr>
+      <w:r>
+        <w:rPr>
+          <w:szCs w:val="24"/>
+        </w:rPr>
+        <w:t xml:space="preserve">Django Software </w:t>
+      </w:r>
+      <w:proofErr w:type="spellStart"/>
+      <w:r>
+        <w:rPr>
+          <w:szCs w:val="24"/>
+        </w:rPr>
+        <w:t>Foundation</w:t>
+      </w:r>
+      <w:proofErr w:type="spellEnd"/>
+      <w:r>
+        <w:rPr>
+          <w:szCs w:val="24"/>
+        </w:rPr>
+        <w:t xml:space="preserve">. (s.f.). Django </w:t>
+      </w:r>
+      <w:proofErr w:type="spellStart"/>
+      <w:r>
+        <w:rPr>
+          <w:szCs w:val="24"/>
+        </w:rPr>
+        <w:t>documentation</w:t>
+      </w:r>
+      <w:proofErr w:type="spellEnd"/>
+      <w:r>
+        <w:rPr>
+          <w:szCs w:val="24"/>
+        </w:rPr>
+        <w:t>. Recuperado de https://docs.djangoproject.com/</w:t>
+      </w:r>
+    </w:p>
+    <w:p>
+      <w:pPr>
+        <w:pStyle w:val="PARRAFOENTREGABLES"/>
+        <w:ind w:left="357" w:hanging="357"/>
+        <w:rPr>
+          <w:szCs w:val="24"/>
+        </w:rPr>
+      </w:pPr>
+      <w:proofErr w:type="spellStart"/>
+      <w:r>
+        <w:rPr>
+          <w:szCs w:val="24"/>
+        </w:rPr>
+        <w:t>django-crispy-forms</w:t>
+      </w:r>
+      <w:proofErr w:type="spellEnd"/>
+      <w:r>
+        <w:rPr>
+          <w:szCs w:val="24"/>
+        </w:rPr>
+        <w:t xml:space="preserve"> </w:t>
+      </w:r>
+      <w:proofErr w:type="spellStart"/>
+      <w:r>
+        <w:rPr>
+          <w:szCs w:val="24"/>
+        </w:rPr>
+        <w:t>contributors</w:t>
+      </w:r>
+      <w:proofErr w:type="spellEnd"/>
+      <w:r>
+        <w:rPr>
+          <w:szCs w:val="24"/>
+        </w:rPr>
+        <w:t xml:space="preserve">. (s.f.). </w:t>
+      </w:r>
+      <w:proofErr w:type="spellStart"/>
+      <w:r>
+        <w:rPr>
+          <w:szCs w:val="24"/>
+        </w:rPr>
+        <w:t>django-crispy-forms</w:t>
+      </w:r>
+      <w:proofErr w:type="spellEnd"/>
+      <w:r>
+        <w:rPr>
+          <w:szCs w:val="24"/>
+        </w:rPr>
+        <w:t xml:space="preserve"> </w:t>
+      </w:r>
+      <w:proofErr w:type="spellStart"/>
+      <w:r>
+        <w:rPr>
+          <w:szCs w:val="24"/>
+        </w:rPr>
+        <w:t>documentation</w:t>
+      </w:r>
+      <w:proofErr w:type="spellEnd"/>
+      <w:r>
+        <w:rPr>
+          <w:szCs w:val="24"/>
+        </w:rPr>
+        <w:t>. Recuperado de https://django-crispy-forms.readthedocs.io/</w:t>
+      </w:r>
+    </w:p>
+    <w:p>
+      <w:pPr>
+        <w:pStyle w:val="PARRAFOENTREGABLES"/>
+        <w:ind w:left="357" w:hanging="357"/>
+        <w:rPr>
+          <w:szCs w:val="24"/>
+        </w:rPr>
+      </w:pPr>
+      <w:r>
+        <w:rPr>
+          <w:szCs w:val="24"/>
+        </w:rPr>
+        <w:t>GitHub, Inc. (s.f.). GitHub Docs. Recuperado de https://docs.github.com/</w:t>
+      </w:r>
+    </w:p>
+    <w:p>
+      <w:pPr>
+        <w:pStyle w:val="PARRAFOENTREGABLES"/>
+        <w:ind w:left="357" w:hanging="357"/>
+        <w:rPr>
+          <w:szCs w:val="24"/>
+        </w:rPr>
+      </w:pPr>
+      <w:r>
+        <w:rPr>
+          <w:szCs w:val="24"/>
+        </w:rPr>
+        <w:t>Google LLC. (s.f.). OAuth 2.0 para aplicaciones web del lado del servidor. Recuperado de https://developers.google.com/identity/protocols/oauth2</w:t>
+      </w:r>
+    </w:p>
+    <w:p>
+      <w:pPr>
+        <w:pStyle w:val="PARRAFOENTREGABLES"/>
+        <w:ind w:left="357" w:hanging="357"/>
+        <w:rPr>
+          <w:szCs w:val="24"/>
+        </w:rPr>
+      </w:pPr>
+      <w:r>
+        <w:rPr>
+          <w:szCs w:val="24"/>
+        </w:rPr>
+        <w:lastRenderedPageBreak/>
+        <w:t xml:space="preserve">Microsoft </w:t>
+      </w:r>
+      <w:proofErr w:type="spellStart"/>
+      <w:r>
+        <w:rPr>
+          <w:szCs w:val="24"/>
+        </w:rPr>
+        <w:t>Corporation</w:t>
+      </w:r>
+      <w:proofErr w:type="spellEnd"/>
+      <w:r>
+        <w:rPr>
+          <w:szCs w:val="24"/>
+        </w:rPr>
+        <w:t>. (s.f.). Documentación de Visual Studio Code. Recuperado de https://code.visualstudio.com/docs</w:t>
+      </w:r>
+    </w:p>
+    <w:p>
+      <w:pPr>
+        <w:pStyle w:val="PARRAFOENTREGABLES"/>
+        <w:ind w:left="357" w:hanging="357"/>
+        <w:rPr>
+          <w:szCs w:val="24"/>
+        </w:rPr>
+      </w:pPr>
+      <w:r>
+        <w:rPr>
+          <w:szCs w:val="24"/>
+        </w:rPr>
+        <w:t xml:space="preserve">Oracle </w:t>
+      </w:r>
+      <w:proofErr w:type="spellStart"/>
+      <w:r>
+        <w:rPr>
+          <w:szCs w:val="24"/>
+        </w:rPr>
+        <w:t>Corporation</w:t>
+      </w:r>
+      <w:proofErr w:type="spellEnd"/>
+      <w:r>
+        <w:rPr>
+          <w:szCs w:val="24"/>
+        </w:rPr>
+        <w:t>. (s.f.). MySQL 8.0 Reference Manual. Recuperado de https://dev.mysql.com/doc/</w:t>
+      </w:r>
+    </w:p>
+    <w:p>
+      <w:pPr>
+        <w:pStyle w:val="PARRAFOENTREGABLES"/>
+        <w:ind w:left="357" w:hanging="357"/>
+        <w:rPr>
+          <w:szCs w:val="24"/>
+        </w:rPr>
+      </w:pPr>
+      <w:proofErr w:type="spellStart"/>
+      <w:r>
+        <w:rPr>
+          <w:szCs w:val="24"/>
+        </w:rPr>
+        <w:t>openpyxl</w:t>
+      </w:r>
+      <w:proofErr w:type="spellEnd"/>
+      <w:r>
+        <w:rPr>
+          <w:szCs w:val="24"/>
+        </w:rPr>
+        <w:t xml:space="preserve"> </w:t>
+      </w:r>
+      <w:proofErr w:type="spellStart"/>
+      <w:r>
+        <w:rPr>
+          <w:szCs w:val="24"/>
+        </w:rPr>
+        <w:t>developers</w:t>
+      </w:r>
+      <w:proofErr w:type="spellEnd"/>
+      <w:r>
+        <w:rPr>
+          <w:szCs w:val="24"/>
+        </w:rPr>
+        <w:t xml:space="preserve">. (s.f.). </w:t>
+      </w:r>
+      <w:proofErr w:type="spellStart"/>
+      <w:r>
+        <w:rPr>
+          <w:szCs w:val="24"/>
+        </w:rPr>
+        <w:t>openpyxl</w:t>
+      </w:r>
+      <w:proofErr w:type="spellEnd"/>
+      <w:r>
+        <w:rPr>
+          <w:szCs w:val="24"/>
+        </w:rPr>
+        <w:t xml:space="preserve"> </w:t>
+      </w:r>
+      <w:proofErr w:type="spellStart"/>
+      <w:r>
+        <w:rPr>
+          <w:szCs w:val="24"/>
+        </w:rPr>
+        <w:t>documentation</w:t>
+      </w:r>
+      <w:proofErr w:type="spellEnd"/>
+      <w:r>
+        <w:rPr>
+          <w:szCs w:val="24"/>
+        </w:rPr>
+        <w:t>. Recuperado de https://openpyxl.readthedocs.io/</w:t>
+      </w:r>
+    </w:p>
+    <w:p>
+      <w:pPr>
+        <w:pStyle w:val="PARRAFOENTREGABLES"/>
+        <w:ind w:left="357" w:hanging="357"/>
+        <w:rPr>
+          <w:szCs w:val="24"/>
+        </w:rPr>
+      </w:pPr>
+      <w:r>
+        <w:rPr>
+          <w:szCs w:val="24"/>
+        </w:rPr>
+        <w:t xml:space="preserve">pandas </w:t>
+      </w:r>
+      <w:proofErr w:type="spellStart"/>
+      <w:r>
+        <w:rPr>
+          <w:szCs w:val="24"/>
+        </w:rPr>
+        <w:t>development</w:t>
+      </w:r>
+      <w:proofErr w:type="spellEnd"/>
+      <w:r>
+        <w:rPr>
+          <w:szCs w:val="24"/>
+        </w:rPr>
+        <w:t xml:space="preserve"> </w:t>
+      </w:r>
+      <w:proofErr w:type="spellStart"/>
+      <w:r>
+        <w:rPr>
+          <w:szCs w:val="24"/>
+        </w:rPr>
+        <w:t>team</w:t>
+      </w:r>
+      <w:proofErr w:type="spellEnd"/>
+      <w:r>
+        <w:rPr>
+          <w:szCs w:val="24"/>
+        </w:rPr>
+        <w:t xml:space="preserve">. (s.f.). pandas </w:t>
+      </w:r>
+      <w:proofErr w:type="spellStart"/>
+      <w:r>
+        <w:rPr>
+          <w:szCs w:val="24"/>
+        </w:rPr>
+        <w:t>documentation</w:t>
+      </w:r>
+      <w:proofErr w:type="spellEnd"/>
+      <w:r>
+        <w:rPr>
+          <w:szCs w:val="24"/>
+        </w:rPr>
+        <w:t>. Recuperado de https://pandas.pydata.org/docs/</w:t>
+      </w:r>
+    </w:p>
+    <w:p>
+      <w:pPr>
+        <w:pStyle w:val="PARRAFOENTREGABLES"/>
+        <w:ind w:left="357" w:hanging="357"/>
+        <w:rPr>
+          <w:szCs w:val="24"/>
+        </w:rPr>
+      </w:pPr>
+      <w:r>
+        <w:rPr>
+          <w:szCs w:val="24"/>
+        </w:rPr>
+        <w:t xml:space="preserve">Python Software </w:t>
+      </w:r>
+      <w:proofErr w:type="spellStart"/>
+      <w:r>
+        <w:rPr>
+          <w:szCs w:val="24"/>
+        </w:rPr>
+        <w:t>Foundation</w:t>
+      </w:r>
+      <w:proofErr w:type="spellEnd"/>
+      <w:r>
+        <w:rPr>
+          <w:szCs w:val="24"/>
+        </w:rPr>
+        <w:t xml:space="preserve">. (s.f.). Python 3 </w:t>
+      </w:r>
+      <w:proofErr w:type="spellStart"/>
+      <w:r>
+        <w:rPr>
+          <w:szCs w:val="24"/>
+        </w:rPr>
+        <w:t>documentation</w:t>
+      </w:r>
+      <w:proofErr w:type="spellEnd"/>
+      <w:r>
+        <w:rPr>
+          <w:szCs w:val="24"/>
+        </w:rPr>
+        <w:t>. Recuperado de https://docs.python.org/3/</w:t>
+      </w:r>
+    </w:p>
+    <w:p>
+      <w:pPr>
+        <w:pStyle w:val="PARRAFOENTREGABLES"/>
+        <w:ind w:left="357" w:hanging="357"/>
+        <w:rPr>
+          <w:szCs w:val="24"/>
+        </w:rPr>
+      </w:pPr>
+      <w:r>
+        <w:rPr>
+          <w:szCs w:val="24"/>
+        </w:rPr>
+        <w:t xml:space="preserve">ReportLab. (s.f.). ReportLab </w:t>
+      </w:r>
+      <w:proofErr w:type="spellStart"/>
+      <w:r>
+        <w:rPr>
+          <w:szCs w:val="24"/>
+        </w:rPr>
+        <w:t>documentation</w:t>
+      </w:r>
+      <w:proofErr w:type="spellEnd"/>
+      <w:r>
+        <w:rPr>
+          <w:szCs w:val="24"/>
+        </w:rPr>
+        <w:t>. Recuperado de https://docs.reportlab.com/</w:t>
+      </w:r>
+    </w:p>
+    <w:p>
+      <w:pPr>
+        <w:pStyle w:val="PARRAFOENTREGABLES"/>
+        <w:ind w:left="357" w:hanging="357"/>
+        <w:rPr>
+          <w:szCs w:val="24"/>
+        </w:rPr>
+      </w:pPr>
+      <w:r>
+        <w:rPr>
+          <w:szCs w:val="24"/>
+        </w:rPr>
+        <w:t xml:space="preserve">Software Freedom </w:t>
+      </w:r>
+      <w:proofErr w:type="spellStart"/>
+      <w:r>
+        <w:rPr>
+          <w:szCs w:val="24"/>
+        </w:rPr>
+        <w:t>Conservancy</w:t>
+      </w:r>
+      <w:proofErr w:type="spellEnd"/>
+      <w:r>
+        <w:rPr>
+          <w:szCs w:val="24"/>
+        </w:rPr>
+        <w:t xml:space="preserve">. (s.f.). Git </w:t>
+      </w:r>
+      <w:proofErr w:type="spellStart"/>
+      <w:r>
+        <w:rPr>
+          <w:szCs w:val="24"/>
+        </w:rPr>
+        <w:t>documentation</w:t>
+      </w:r>
+      <w:proofErr w:type="spellEnd"/>
+      <w:r>
+        <w:rPr>
+          <w:szCs w:val="24"/>
+        </w:rPr>
+        <w:t>. Recuperado de https://git-scm.com/doc</w:t>
+      </w:r>
+    </w:p>
+    <w:p>
+      <w:pPr>
+        <w:pStyle w:val="PARRAFOENTREGABLES"/>
+        <w:ind w:left="357" w:hanging="357"/>
+        <w:rPr>
+          <w:szCs w:val="24"/>
+        </w:rPr>
+      </w:pPr>
+      <w:proofErr w:type="spellStart"/>
+      <w:r>
+        <w:rPr>
+          <w:szCs w:val="24"/>
+        </w:rPr>
+        <w:t>SpryMedia</w:t>
+      </w:r>
+      <w:proofErr w:type="spellEnd"/>
+      <w:r>
+        <w:rPr>
+          <w:szCs w:val="24"/>
+        </w:rPr>
+        <w:t xml:space="preserve"> Ltd. (s.f.). DataTables </w:t>
+      </w:r>
+      <w:proofErr w:type="spellStart"/>
+      <w:r>
+        <w:rPr>
+          <w:szCs w:val="24"/>
+        </w:rPr>
+        <w:t>documentation</w:t>
+      </w:r>
+      <w:proofErr w:type="spellEnd"/>
+      <w:r>
+        <w:rPr>
+          <w:szCs w:val="24"/>
+        </w:rPr>
+        <w:t>. Recuperado de https://datatables.net/</w:t>
+      </w:r>
+    </w:p>
+    <w:p>
+      <w:pPr>
+        <w:pStyle w:val="PARRAFOENTREGABLES"/>
+        <w:ind w:left="357" w:hanging="357"/>
+        <w:rPr>
+          <w:szCs w:val="24"/>
+        </w:rPr>
+      </w:pPr>
+      <w:r>
+        <w:rPr>
+          <w:szCs w:val="24"/>
+        </w:rPr>
+        <w:t xml:space="preserve">Tabulator. (s.f.). Tabulator </w:t>
+      </w:r>
+      <w:proofErr w:type="spellStart"/>
+      <w:r>
+        <w:rPr>
+          <w:szCs w:val="24"/>
+        </w:rPr>
+        <w:t>documentation</w:t>
+      </w:r>
+      <w:proofErr w:type="spellEnd"/>
+      <w:r>
+        <w:rPr>
+          <w:szCs w:val="24"/>
+        </w:rPr>
+        <w:t xml:space="preserve"> (v6.x). Recuperado de https://tabulator.info/docs/6.x</w:t>
+      </w:r>
     </w:p>
     <w:p/>
     <w:p/>
+    <w:p>
+      <w:pPr>
+        <w:pStyle w:val="Ttulo1"/>
+      </w:pPr>
+      <w:bookmarkStart w:id="63" w:name="_Toc237022992"/>
+      <w:r>
+        <w:t>GLOSARIO</w:t>
+      </w:r>
+      <w:bookmarkEnd w:id="63"/>
+    </w:p>
     <w:p/>
     <w:p>
       <w:pPr>
-        <w:pStyle w:val="Ttulo1"/>
-      </w:pPr>
-      <w:bookmarkStart w:id="53" w:name="_Toc236851860"/>
-      <w:r>
-        <w:t>GLOSARIO</w:t>
-      </w:r>
-      <w:bookmarkEnd w:id="53"/>
+        <w:spacing w:line="360" w:lineRule="auto"/>
+        <w:jc w:val="both"/>
+        <w:rPr>
+          <w:sz w:val="24"/>
+          <w:szCs w:val="24"/>
+        </w:rPr>
+      </w:pPr>
+      <w:proofErr w:type="spellStart"/>
+      <w:r>
+        <w:rPr>
+          <w:b/>
+          <w:bCs/>
+          <w:sz w:val="24"/>
+          <w:szCs w:val="24"/>
+        </w:rPr>
+        <w:t>Backend</w:t>
+      </w:r>
+      <w:proofErr w:type="spellEnd"/>
+      <w:r>
+        <w:rPr>
+          <w:b/>
+          <w:bCs/>
+          <w:sz w:val="24"/>
+          <w:szCs w:val="24"/>
+        </w:rPr>
+        <w:t>:</w:t>
+      </w:r>
+      <w:r>
+        <w:rPr>
+          <w:sz w:val="24"/>
+          <w:szCs w:val="24"/>
+        </w:rPr>
+        <w:t xml:space="preserve"> Parte del sistema que se ejecuta en el servidor y maneja la lógica de negocio, el acceso a la base de datos y la generación de las respuestas que consume el navegador.</w:t>
+      </w:r>
+    </w:p>
+    <w:p>
+      <w:pPr>
+        <w:spacing w:line="360" w:lineRule="auto"/>
+        <w:jc w:val="both"/>
+        <w:rPr>
+          <w:sz w:val="24"/>
+          <w:szCs w:val="24"/>
+        </w:rPr>
+      </w:pPr>
+      <w:r>
+        <w:rPr>
+          <w:b/>
+          <w:bCs/>
+          <w:sz w:val="24"/>
+          <w:szCs w:val="24"/>
+        </w:rPr>
+        <w:t>Bitácora:</w:t>
+      </w:r>
+      <w:r>
+        <w:rPr>
+          <w:sz w:val="24"/>
+          <w:szCs w:val="24"/>
+        </w:rPr>
+        <w:t xml:space="preserve"> Registro histórico de las acciones realizadas por los usuarios del sistema (inicios de sesión, creación, modificación, eliminación de registros, errores, exportaciones), usado para auditoría.</w:t>
+      </w:r>
+    </w:p>
+    <w:p>
+      <w:pPr>
+        <w:spacing w:line="360" w:lineRule="auto"/>
+        <w:jc w:val="both"/>
+        <w:rPr>
+          <w:sz w:val="24"/>
+          <w:szCs w:val="24"/>
+        </w:rPr>
+      </w:pPr>
+      <w:r>
+        <w:rPr>
+          <w:b/>
+          <w:bCs/>
+          <w:sz w:val="24"/>
+          <w:szCs w:val="24"/>
+        </w:rPr>
+        <w:t>CRUD:</w:t>
+      </w:r>
+      <w:r>
+        <w:rPr>
+          <w:sz w:val="24"/>
+          <w:szCs w:val="24"/>
+        </w:rPr>
+        <w:t xml:space="preserve"> Acrónimo de Crear, Leer (Read), Actualizar (</w:t>
+      </w:r>
+      <w:proofErr w:type="spellStart"/>
+      <w:r>
+        <w:rPr>
+          <w:sz w:val="24"/>
+          <w:szCs w:val="24"/>
+        </w:rPr>
+        <w:t>Update</w:t>
+      </w:r>
+      <w:proofErr w:type="spellEnd"/>
+      <w:r>
+        <w:rPr>
+          <w:sz w:val="24"/>
+          <w:szCs w:val="24"/>
+        </w:rPr>
+        <w:t>) y Eliminar (</w:t>
+      </w:r>
+      <w:proofErr w:type="spellStart"/>
+      <w:r>
+        <w:rPr>
+          <w:sz w:val="24"/>
+          <w:szCs w:val="24"/>
+        </w:rPr>
+        <w:t>Delete</w:t>
+      </w:r>
+      <w:proofErr w:type="spellEnd"/>
+      <w:r>
+        <w:rPr>
+          <w:sz w:val="24"/>
+          <w:szCs w:val="24"/>
+        </w:rPr>
+        <w:t>) — las cuatro operaciones básicas que un sistema realiza sobre los datos.</w:t>
+      </w:r>
+    </w:p>
+    <w:p>
+      <w:pPr>
+        <w:spacing w:line="360" w:lineRule="auto"/>
+        <w:jc w:val="both"/>
+        <w:rPr>
+          <w:sz w:val="24"/>
+          <w:szCs w:val="24"/>
+        </w:rPr>
+      </w:pPr>
+      <w:r>
+        <w:rPr>
+          <w:b/>
+          <w:bCs/>
+          <w:sz w:val="24"/>
+          <w:szCs w:val="24"/>
+        </w:rPr>
+        <w:t>Database First:</w:t>
+      </w:r>
+      <w:r>
+        <w:rPr>
+          <w:sz w:val="24"/>
+          <w:szCs w:val="24"/>
+        </w:rPr>
+        <w:t xml:space="preserve"> Enfoque de desarrollo en el que el esquema de la base de datos se diseña y mantiene de forma independiente al código, y el framework (Django) se conecta a las tablas ya existentes en lugar de generarlas mediante migraciones automáticas.</w:t>
+      </w:r>
+    </w:p>
+    <w:p>
+      <w:pPr>
+        <w:spacing w:line="360" w:lineRule="auto"/>
+        <w:jc w:val="both"/>
+        <w:rPr>
+          <w:sz w:val="24"/>
+          <w:szCs w:val="24"/>
+        </w:rPr>
+      </w:pPr>
+      <w:r>
+        <w:rPr>
+          <w:b/>
+          <w:bCs/>
+          <w:sz w:val="24"/>
+          <w:szCs w:val="24"/>
+        </w:rPr>
+        <w:t xml:space="preserve">DDL (Data </w:t>
+      </w:r>
+      <w:proofErr w:type="spellStart"/>
+      <w:r>
+        <w:rPr>
+          <w:b/>
+          <w:bCs/>
+          <w:sz w:val="24"/>
+          <w:szCs w:val="24"/>
+        </w:rPr>
+        <w:t>Definition</w:t>
+      </w:r>
+      <w:proofErr w:type="spellEnd"/>
+      <w:r>
+        <w:rPr>
+          <w:b/>
+          <w:bCs/>
+          <w:sz w:val="24"/>
+          <w:szCs w:val="24"/>
+        </w:rPr>
+        <w:t xml:space="preserve"> </w:t>
+      </w:r>
+      <w:proofErr w:type="spellStart"/>
+      <w:r>
+        <w:rPr>
+          <w:b/>
+          <w:bCs/>
+          <w:sz w:val="24"/>
+          <w:szCs w:val="24"/>
+        </w:rPr>
+        <w:t>Language</w:t>
+      </w:r>
+      <w:proofErr w:type="spellEnd"/>
+      <w:r>
+        <w:rPr>
+          <w:b/>
+          <w:bCs/>
+          <w:sz w:val="24"/>
+          <w:szCs w:val="24"/>
+        </w:rPr>
+        <w:t>):</w:t>
+      </w:r>
+      <w:r>
+        <w:rPr>
+          <w:sz w:val="24"/>
+          <w:szCs w:val="24"/>
+        </w:rPr>
+        <w:t xml:space="preserve"> Conjunto de sentencias SQL (CREATE TABLE, ALTER TABLE) usadas para definir y modificar la estructura de las tablas de una base de datos.</w:t>
+      </w:r>
+    </w:p>
+    <w:p>
+      <w:pPr>
+        <w:spacing w:line="360" w:lineRule="auto"/>
+        <w:jc w:val="both"/>
+        <w:rPr>
+          <w:sz w:val="24"/>
+          <w:szCs w:val="24"/>
+        </w:rPr>
+      </w:pPr>
+      <w:r>
+        <w:rPr>
+          <w:b/>
+          <w:bCs/>
+          <w:sz w:val="24"/>
+          <w:szCs w:val="24"/>
+        </w:rPr>
+        <w:lastRenderedPageBreak/>
+        <w:t>Decorador:</w:t>
+      </w:r>
+      <w:r>
+        <w:rPr>
+          <w:sz w:val="24"/>
+          <w:szCs w:val="24"/>
+        </w:rPr>
+        <w:t xml:space="preserve"> Función de Python que envuelve a otra función o vista para agregarle comportamiento adicional sin modificar su código, como validar que el usuario esté autenticado o tenga cierto permiso antes de ejecutar una vista.</w:t>
+      </w:r>
+    </w:p>
+    <w:p>
+      <w:pPr>
+        <w:spacing w:line="360" w:lineRule="auto"/>
+        <w:jc w:val="both"/>
+        <w:rPr>
+          <w:sz w:val="24"/>
+          <w:szCs w:val="24"/>
+        </w:rPr>
+      </w:pPr>
+      <w:r>
+        <w:rPr>
+          <w:b/>
+          <w:bCs/>
+          <w:sz w:val="24"/>
+          <w:szCs w:val="24"/>
+        </w:rPr>
+        <w:t>Framework:</w:t>
+      </w:r>
+      <w:r>
+        <w:rPr>
+          <w:sz w:val="24"/>
+          <w:szCs w:val="24"/>
+        </w:rPr>
+        <w:t xml:space="preserve"> Conjunto de herramientas, bibliotecas y convenciones que facilita el desarrollo de software siguiendo una estructura predefinida; en este proyecto, Django.</w:t>
+      </w:r>
+    </w:p>
+    <w:p>
+      <w:pPr>
+        <w:spacing w:line="360" w:lineRule="auto"/>
+        <w:jc w:val="both"/>
+        <w:rPr>
+          <w:sz w:val="24"/>
+          <w:szCs w:val="24"/>
+        </w:rPr>
+      </w:pPr>
+      <w:r>
+        <w:rPr>
+          <w:b/>
+          <w:bCs/>
+          <w:sz w:val="24"/>
+          <w:szCs w:val="24"/>
+        </w:rPr>
+        <w:t>Idempotente:</w:t>
+      </w:r>
+      <w:r>
+        <w:rPr>
+          <w:sz w:val="24"/>
+          <w:szCs w:val="24"/>
+        </w:rPr>
+        <w:t xml:space="preserve"> Que produce el mismo resultado sin importar cuántas veces se ejecute; los comandos de siembra de datos (</w:t>
+      </w:r>
+      <w:proofErr w:type="spellStart"/>
+      <w:r>
+        <w:rPr>
+          <w:sz w:val="24"/>
+          <w:szCs w:val="24"/>
+        </w:rPr>
+        <w:t>seed_admin</w:t>
+      </w:r>
+      <w:proofErr w:type="spellEnd"/>
+      <w:r>
+        <w:rPr>
+          <w:sz w:val="24"/>
+          <w:szCs w:val="24"/>
+        </w:rPr>
+        <w:t xml:space="preserve">, </w:t>
+      </w:r>
+      <w:proofErr w:type="spellStart"/>
+      <w:r>
+        <w:rPr>
+          <w:sz w:val="24"/>
+          <w:szCs w:val="24"/>
+        </w:rPr>
+        <w:t>seed_permisos_modulos</w:t>
+      </w:r>
+      <w:proofErr w:type="spellEnd"/>
+      <w:r>
+        <w:rPr>
+          <w:sz w:val="24"/>
+          <w:szCs w:val="24"/>
+        </w:rPr>
+        <w:t>, etc.) están diseñados para ser idempotentes, de modo que correrlos más de una vez no duplica ni daña la información existente.</w:t>
+      </w:r>
+    </w:p>
+    <w:p>
+      <w:pPr>
+        <w:spacing w:line="360" w:lineRule="auto"/>
+        <w:jc w:val="both"/>
+        <w:rPr>
+          <w:sz w:val="24"/>
+          <w:szCs w:val="24"/>
+        </w:rPr>
+      </w:pPr>
+      <w:r>
+        <w:rPr>
+          <w:b/>
+          <w:bCs/>
+          <w:sz w:val="24"/>
+          <w:szCs w:val="24"/>
+        </w:rPr>
+        <w:t xml:space="preserve">KPI (Key Performance </w:t>
+      </w:r>
+      <w:proofErr w:type="spellStart"/>
+      <w:r>
+        <w:rPr>
+          <w:b/>
+          <w:bCs/>
+          <w:sz w:val="24"/>
+          <w:szCs w:val="24"/>
+        </w:rPr>
+        <w:t>Indicator</w:t>
+      </w:r>
+      <w:proofErr w:type="spellEnd"/>
+      <w:r>
+        <w:rPr>
+          <w:b/>
+          <w:bCs/>
+          <w:sz w:val="24"/>
+          <w:szCs w:val="24"/>
+        </w:rPr>
+        <w:t>):</w:t>
+      </w:r>
+      <w:r>
+        <w:rPr>
+          <w:sz w:val="24"/>
+          <w:szCs w:val="24"/>
+        </w:rPr>
+        <w:t xml:space="preserve"> Indicador clave de desempeño; en SIGEPAN, valores como ventas del día, diferencia de caja o mermas registradas, mostrados en el </w:t>
+      </w:r>
+      <w:proofErr w:type="spellStart"/>
+      <w:r>
+        <w:rPr>
+          <w:sz w:val="24"/>
+          <w:szCs w:val="24"/>
+        </w:rPr>
+        <w:t>dashboard</w:t>
+      </w:r>
+      <w:proofErr w:type="spellEnd"/>
+      <w:r>
+        <w:rPr>
+          <w:sz w:val="24"/>
+          <w:szCs w:val="24"/>
+        </w:rPr>
+        <w:t>.</w:t>
+      </w:r>
+    </w:p>
+    <w:p>
+      <w:pPr>
+        <w:spacing w:line="360" w:lineRule="auto"/>
+        <w:jc w:val="both"/>
+        <w:rPr>
+          <w:sz w:val="24"/>
+          <w:szCs w:val="24"/>
+        </w:rPr>
+      </w:pPr>
+      <w:r>
+        <w:rPr>
+          <w:b/>
+          <w:bCs/>
+          <w:sz w:val="24"/>
+          <w:szCs w:val="24"/>
+        </w:rPr>
+        <w:t>Merma:</w:t>
+      </w:r>
+      <w:r>
+        <w:rPr>
+          <w:sz w:val="24"/>
+          <w:szCs w:val="24"/>
+        </w:rPr>
+        <w:t xml:space="preserve"> Pérdida de producto por daño, vencimiento u otra causa, que se registra en el sistema para llevar control de inventario y costos.</w:t>
+      </w:r>
+    </w:p>
+    <w:p>
+      <w:pPr>
+        <w:spacing w:line="360" w:lineRule="auto"/>
+        <w:jc w:val="both"/>
+        <w:rPr>
+          <w:sz w:val="24"/>
+          <w:szCs w:val="24"/>
+        </w:rPr>
+      </w:pPr>
+      <w:r>
+        <w:rPr>
+          <w:b/>
+          <w:bCs/>
+          <w:sz w:val="24"/>
+          <w:szCs w:val="24"/>
+        </w:rPr>
+        <w:t>Middleware:</w:t>
+      </w:r>
+      <w:r>
+        <w:rPr>
+          <w:sz w:val="24"/>
+          <w:szCs w:val="24"/>
+        </w:rPr>
+        <w:t xml:space="preserve"> Componente que procesa las solicitudes y respuestas HTTP de forma transversal a toda la aplicación, antes de que lleguen a la vista o después de que esta responde.</w:t>
+      </w:r>
+    </w:p>
+    <w:p>
+      <w:pPr>
+        <w:spacing w:line="360" w:lineRule="auto"/>
+        <w:jc w:val="both"/>
+        <w:rPr>
+          <w:sz w:val="24"/>
+          <w:szCs w:val="24"/>
+        </w:rPr>
+      </w:pPr>
+      <w:r>
+        <w:rPr>
+          <w:b/>
+          <w:bCs/>
+          <w:sz w:val="24"/>
+          <w:szCs w:val="24"/>
+        </w:rPr>
+        <w:t>Migración:</w:t>
+      </w:r>
+      <w:r>
+        <w:rPr>
+          <w:sz w:val="24"/>
+          <w:szCs w:val="24"/>
+        </w:rPr>
+        <w:t xml:space="preserve"> Mecanismo de Django para versionar y aplicar cambios al esquema de la base de datos de forma automática. En SIGEPAN no se usa para las tablas de negocio (ver Database First).</w:t>
+      </w:r>
+    </w:p>
+    <w:p>
+      <w:pPr>
+        <w:spacing w:line="360" w:lineRule="auto"/>
+        <w:jc w:val="both"/>
+        <w:rPr>
+          <w:sz w:val="24"/>
+          <w:szCs w:val="24"/>
+        </w:rPr>
+      </w:pPr>
+      <w:r>
+        <w:rPr>
+          <w:b/>
+          <w:bCs/>
+          <w:sz w:val="24"/>
+          <w:szCs w:val="24"/>
+        </w:rPr>
+        <w:t>Modelo (ORM):</w:t>
+      </w:r>
+      <w:r>
+        <w:rPr>
+          <w:sz w:val="24"/>
+          <w:szCs w:val="24"/>
+        </w:rPr>
+        <w:t xml:space="preserve"> Clase de Python que representa una tabla de la base de datos, donde cada atributo corresponde a una columna.</w:t>
+      </w:r>
+    </w:p>
+    <w:p>
+      <w:pPr>
+        <w:spacing w:line="360" w:lineRule="auto"/>
+        <w:jc w:val="both"/>
+        <w:rPr>
+          <w:sz w:val="24"/>
+          <w:szCs w:val="24"/>
+        </w:rPr>
+      </w:pPr>
+      <w:r>
+        <w:rPr>
+          <w:b/>
+          <w:bCs/>
+          <w:sz w:val="24"/>
+          <w:szCs w:val="24"/>
+        </w:rPr>
+        <w:t>MVT (Model-View-</w:t>
+      </w:r>
+      <w:proofErr w:type="spellStart"/>
+      <w:r>
+        <w:rPr>
+          <w:b/>
+          <w:bCs/>
+          <w:sz w:val="24"/>
+          <w:szCs w:val="24"/>
+        </w:rPr>
+        <w:t>Template</w:t>
+      </w:r>
+      <w:proofErr w:type="spellEnd"/>
+      <w:r>
+        <w:rPr>
+          <w:b/>
+          <w:bCs/>
+          <w:sz w:val="24"/>
+          <w:szCs w:val="24"/>
+        </w:rPr>
+        <w:t>):</w:t>
+      </w:r>
+      <w:r>
+        <w:rPr>
+          <w:sz w:val="24"/>
+          <w:szCs w:val="24"/>
+        </w:rPr>
+        <w:t xml:space="preserve"> Patrón de arquitectura de Django, variante de MVC, donde el Modelo maneja los datos, la Vista contiene la lógica de la solicitud y el </w:t>
+      </w:r>
+      <w:proofErr w:type="spellStart"/>
+      <w:r>
+        <w:rPr>
+          <w:sz w:val="24"/>
+          <w:szCs w:val="24"/>
+        </w:rPr>
+        <w:t>Template</w:t>
+      </w:r>
+      <w:proofErr w:type="spellEnd"/>
+      <w:r>
+        <w:rPr>
+          <w:sz w:val="24"/>
+          <w:szCs w:val="24"/>
+        </w:rPr>
+        <w:t xml:space="preserve"> genera la salida HTML.</w:t>
+      </w:r>
+    </w:p>
+    <w:p>
+      <w:pPr>
+        <w:spacing w:line="360" w:lineRule="auto"/>
+        <w:jc w:val="both"/>
+        <w:rPr>
+          <w:sz w:val="24"/>
+          <w:szCs w:val="24"/>
+        </w:rPr>
+      </w:pPr>
+      <w:r>
+        <w:rPr>
+          <w:b/>
+          <w:bCs/>
+          <w:sz w:val="24"/>
+          <w:szCs w:val="24"/>
+        </w:rPr>
+        <w:t>OAuth 2.0:</w:t>
+      </w:r>
+      <w:r>
+        <w:rPr>
+          <w:sz w:val="24"/>
+          <w:szCs w:val="24"/>
+        </w:rPr>
+        <w:t xml:space="preserve"> Protocolo estándar de autorización que permite a una aplicación acceder a recursos de otra (como la cuenta de Google de un usuario) sin manejar directamente su contraseña.</w:t>
+      </w:r>
+    </w:p>
+    <w:p>
+      <w:pPr>
+        <w:spacing w:line="360" w:lineRule="auto"/>
+        <w:jc w:val="both"/>
+        <w:rPr>
+          <w:sz w:val="24"/>
+          <w:szCs w:val="24"/>
+        </w:rPr>
+      </w:pPr>
+      <w:r>
+        <w:rPr>
+          <w:b/>
+          <w:bCs/>
+          <w:sz w:val="24"/>
+          <w:szCs w:val="24"/>
+        </w:rPr>
+        <w:t>ORM (</w:t>
+      </w:r>
+      <w:proofErr w:type="spellStart"/>
+      <w:r>
+        <w:rPr>
+          <w:b/>
+          <w:bCs/>
+          <w:sz w:val="24"/>
+          <w:szCs w:val="24"/>
+        </w:rPr>
+        <w:t>Object-Relational</w:t>
+      </w:r>
+      <w:proofErr w:type="spellEnd"/>
+      <w:r>
+        <w:rPr>
+          <w:b/>
+          <w:bCs/>
+          <w:sz w:val="24"/>
+          <w:szCs w:val="24"/>
+        </w:rPr>
+        <w:t xml:space="preserve"> </w:t>
+      </w:r>
+      <w:proofErr w:type="spellStart"/>
+      <w:r>
+        <w:rPr>
+          <w:b/>
+          <w:bCs/>
+          <w:sz w:val="24"/>
+          <w:szCs w:val="24"/>
+        </w:rPr>
+        <w:t>Mapping</w:t>
+      </w:r>
+      <w:proofErr w:type="spellEnd"/>
+      <w:r>
+        <w:rPr>
+          <w:b/>
+          <w:bCs/>
+          <w:sz w:val="24"/>
+          <w:szCs w:val="24"/>
+        </w:rPr>
+        <w:t>):</w:t>
+      </w:r>
+      <w:r>
+        <w:rPr>
+          <w:sz w:val="24"/>
+          <w:szCs w:val="24"/>
+        </w:rPr>
+        <w:t xml:space="preserve"> Técnica que permite interactuar con la base de datos usando objetos y clases de Python en lugar de escribir SQL directamente.</w:t>
+      </w:r>
+    </w:p>
+    <w:p>
+      <w:pPr>
+        <w:spacing w:line="360" w:lineRule="auto"/>
+        <w:jc w:val="both"/>
+        <w:rPr>
+          <w:sz w:val="24"/>
+          <w:szCs w:val="24"/>
+        </w:rPr>
+      </w:pPr>
+      <w:proofErr w:type="spellStart"/>
+      <w:r>
+        <w:rPr>
+          <w:b/>
+          <w:bCs/>
+          <w:sz w:val="24"/>
+          <w:szCs w:val="24"/>
+        </w:rPr>
+        <w:lastRenderedPageBreak/>
+        <w:t>Repository</w:t>
+      </w:r>
+      <w:proofErr w:type="spellEnd"/>
+      <w:r>
+        <w:rPr>
+          <w:b/>
+          <w:bCs/>
+          <w:sz w:val="24"/>
+          <w:szCs w:val="24"/>
+        </w:rPr>
+        <w:t xml:space="preserve"> (patrón):</w:t>
+      </w:r>
+      <w:r>
+        <w:rPr>
+          <w:sz w:val="24"/>
+          <w:szCs w:val="24"/>
+        </w:rPr>
+        <w:t xml:space="preserve"> Capa de la arquitectura del proyecto encargada exclusivamente de las consultas a la base de datos, separada de la lógica de negocio.</w:t>
+      </w:r>
+    </w:p>
+    <w:p>
+      <w:pPr>
+        <w:spacing w:line="360" w:lineRule="auto"/>
+        <w:jc w:val="both"/>
+        <w:rPr>
+          <w:sz w:val="24"/>
+          <w:szCs w:val="24"/>
+        </w:rPr>
+      </w:pPr>
+      <w:r>
+        <w:rPr>
+          <w:b/>
+          <w:bCs/>
+          <w:sz w:val="24"/>
+          <w:szCs w:val="24"/>
+        </w:rPr>
+        <w:t>RF (Requisito Funcional):</w:t>
+      </w:r>
+      <w:r>
+        <w:rPr>
+          <w:sz w:val="24"/>
+          <w:szCs w:val="24"/>
+        </w:rPr>
+        <w:t xml:space="preserve"> Requisito que describe una función o comportamiento específico que el sistema debe cumplir.</w:t>
+      </w:r>
+    </w:p>
+    <w:p>
+      <w:pPr>
+        <w:spacing w:line="360" w:lineRule="auto"/>
+        <w:jc w:val="both"/>
+        <w:rPr>
+          <w:sz w:val="24"/>
+          <w:szCs w:val="24"/>
+        </w:rPr>
+      </w:pPr>
+      <w:r>
+        <w:rPr>
+          <w:b/>
+          <w:bCs/>
+          <w:sz w:val="24"/>
+          <w:szCs w:val="24"/>
+        </w:rPr>
+        <w:t>Service (patrón):</w:t>
+      </w:r>
+      <w:r>
+        <w:rPr>
+          <w:sz w:val="24"/>
+          <w:szCs w:val="24"/>
+        </w:rPr>
+        <w:t xml:space="preserve"> Capa de la arquitectura del proyecto que concentra la lógica de negocio y las reglas de validación, entre el </w:t>
+      </w:r>
+      <w:proofErr w:type="spellStart"/>
+      <w:r>
+        <w:rPr>
+          <w:sz w:val="24"/>
+          <w:szCs w:val="24"/>
+        </w:rPr>
+        <w:t>Repository</w:t>
+      </w:r>
+      <w:proofErr w:type="spellEnd"/>
+      <w:r>
+        <w:rPr>
+          <w:sz w:val="24"/>
+          <w:szCs w:val="24"/>
+        </w:rPr>
+        <w:t xml:space="preserve"> y la Vista.</w:t>
+      </w:r>
+    </w:p>
+    <w:p>
+      <w:pPr>
+        <w:spacing w:line="360" w:lineRule="auto"/>
+        <w:jc w:val="both"/>
+        <w:rPr>
+          <w:sz w:val="24"/>
+          <w:szCs w:val="24"/>
+        </w:rPr>
+      </w:pPr>
+      <w:r>
+        <w:rPr>
+          <w:b/>
+          <w:bCs/>
+          <w:sz w:val="24"/>
+          <w:szCs w:val="24"/>
+        </w:rPr>
+        <w:t>Vinculación de cuenta:</w:t>
+      </w:r>
+      <w:r>
+        <w:rPr>
+          <w:sz w:val="24"/>
+          <w:szCs w:val="24"/>
+        </w:rPr>
+        <w:t xml:space="preserve"> Proceso mediante el cual un usuario conecta su cuenta de SIGEPAN con su cuenta de Google, usando OAuth 2.0, para habilitar funciones como el inicio de sesión con Google o la exportación de reportes a Google Sheets.</w:t>
+      </w:r>
+    </w:p>
+    <w:p>
+      <w:pPr>
+        <w:spacing w:line="360" w:lineRule="auto"/>
+        <w:jc w:val="both"/>
+        <w:rPr>
+          <w:sz w:val="24"/>
+          <w:szCs w:val="24"/>
+        </w:rPr>
+      </w:pPr>
+      <w:proofErr w:type="spellStart"/>
+      <w:r>
+        <w:rPr>
+          <w:b/>
+          <w:bCs/>
+          <w:sz w:val="24"/>
+          <w:szCs w:val="24"/>
+        </w:rPr>
+        <w:t>ValidationError</w:t>
+      </w:r>
+      <w:proofErr w:type="spellEnd"/>
+      <w:r>
+        <w:rPr>
+          <w:b/>
+          <w:bCs/>
+          <w:sz w:val="24"/>
+          <w:szCs w:val="24"/>
+        </w:rPr>
+        <w:t>:</w:t>
+      </w:r>
+      <w:r>
+        <w:rPr>
+          <w:sz w:val="24"/>
+          <w:szCs w:val="24"/>
+        </w:rPr>
+        <w:t xml:space="preserve"> Excepción de Django que se genera cuando un dato no cumple con las reglas de negocio definidas, y que el sistema captura para mostrar un mensaje de error claro al usuario en vez de fallar de forma abrupta.</w:t>
+      </w:r>
+    </w:p>
+    <w:p>
+      <w:pPr>
+        <w:rPr>
+          <w:u w:val="single"/>
+        </w:rPr>
+      </w:pPr>
     </w:p>
     <w:p/>
-    <w:p>
-      <w:pPr>
-        <w:pStyle w:val="Ttulo1"/>
-      </w:pPr>
-      <w:bookmarkStart w:id="54" w:name="_Toc236851861"/>
-      <w:r>
-        <w:t>ANEXOS</w:t>
-      </w:r>
-      <w:bookmarkEnd w:id="54"/>
-    </w:p>
     <w:sectPr>
       <w:headerReference w:type="default" r:id="rId67"/>
       <w:footerReference w:type="default" r:id="rId68"/>
@@ -8264,13 +10315,13 @@
     </w:sdtContent>
   </w:sdt>
   <w:p>
-    <w:bookmarkStart w:id="57" w:name="_Hlk232362242"/>
-    <w:bookmarkStart w:id="58" w:name="_Hlk232362243"/>
+    <w:bookmarkStart w:id="66" w:name="_Hlk232362242"/>
+    <w:bookmarkStart w:id="67" w:name="_Hlk232362243"/>
     <w:r>
       <w:t>SIGEPAN desarrollado por Y&amp;C SYSTEMS</w:t>
     </w:r>
-    <w:bookmarkEnd w:id="57"/>
-    <w:bookmarkEnd w:id="58"/>
+    <w:bookmarkEnd w:id="66"/>
+    <w:bookmarkEnd w:id="67"/>
   </w:p>
 </w:ftr>
 </file>
@@ -8303,13 +10354,13 @@
 <file path=word/header1.xml><?xml version="1.0" encoding="utf-8"?>
 <w:hdr xmlns:wpc="http://schemas.microsoft.com/office/word/2010/wordprocessingCanvas" xmlns:cx="http://schemas.microsoft.com/office/drawing/2014/chartex" xmlns:cx1="http://schemas.microsoft.com/office/drawing/2015/9/8/chartex" xmlns:cx2="http://schemas.microsoft.com/office/drawing/2015/10/21/chartex" xmlns:cx3="http://schemas.microsoft.com/office/drawing/2016/5/9/chartex" xmlns:cx4="http://schemas.microsoft.com/office/drawing/2016/5/10/chartex" xmlns:cx5="http://schemas.microsoft.com/office/drawing/2016/5/11/chartex" xmlns:cx6="http://schemas.microsoft.com/office/drawing/2016/5/12/chartex" xmlns:cx7="http://schemas.microsoft.com/office/drawing/2016/5/13/chartex" xmlns:cx8="http://schemas.microsoft.com/office/drawing/2016/5/14/chartex" xmlns:mc="http://schemas.openxmlformats.org/markup-compatibility/2006" xmlns:aink="http://schemas.microsoft.com/office/drawing/2016/ink" xmlns:am3d="http://schemas.microsoft.com/office/drawing/2017/model3d" xmlns:o="urn:schemas-microsoft-com:office:office" xmlns:oel="http://schemas.microsoft.com/office/2019/extlst" xmlns:r="http://schemas.openxmlformats.org/officeDocument/2006/relationships" xmlns:m="http://schemas.openxmlformats.org/officeDocument/2006/math" xmlns:v="urn:schemas-microsoft-com:vml" xmlns:wp14="http://schemas.microsoft.com/office/word/2010/wordprocessingDrawing" xmlns:wp="http://schemas.openxmlformats.org/drawingml/2006/wordprocessingDrawing" xmlns:w10="urn:schemas-microsoft-com:office:word" xmlns:w="http://schemas.openxmlformats.org/wordprocessingml/2006/main" xmlns:w14="http://schemas.microsoft.com/office/word/2010/wordml" xmlns:w15="http://schemas.microsoft.com/office/word/2012/wordml" xmlns:w16cei="http://schemas.microsoft.com/office/word/2026/wordml/cei" xmlns:w16cex="http://schemas.microsoft.com/office/word/2018/wordml/cex" xmlns:w16cid="http://schemas.microsoft.com/office/word/2016/wordml/cid" xmlns:w16="http://schemas.microsoft.com/office/word/2018/wordml" xmlns:w16du="http://schemas.microsoft.com/office/word/2023/wordml/word16du" xmlns:w16sdtdh="http://schemas.microsoft.com/office/word/2020/wordml/sdtdatahash" xmlns:w16sdtfl="http://schemas.microsoft.com/office/word/2024/wordml/sdtformatlock" xmlns:w16se="http://schemas.microsoft.com/office/word/2015/wordml/symex" xmlns:wpg="http://schemas.microsoft.com/office/word/2010/wordprocessingGroup" xmlns:wpi="http://schemas.microsoft.com/office/word/2010/wordprocessingInk" xmlns:wne="http://schemas.microsoft.com/office/word/2006/wordml" xmlns:wps="http://schemas.microsoft.com/office/word/2010/wordprocessingShape" mc:Ignorable="w14 w15 w16se w16cid w16 w16cex w16sdtdh w16sdtfl w16du wp14">
   <w:p>
-    <w:bookmarkStart w:id="55" w:name="_Hlk232362235"/>
-    <w:bookmarkStart w:id="56" w:name="_Hlk232362236"/>
+    <w:bookmarkStart w:id="64" w:name="_Hlk232362235"/>
+    <w:bookmarkStart w:id="65" w:name="_Hlk232362236"/>
     <w:r>
       <w:t>Proyecto Profesional Informático- Yilbert Fernández Espinoza y Cesar Campos Torres</w:t>
     </w:r>
-    <w:bookmarkEnd w:id="55"/>
-    <w:bookmarkEnd w:id="56"/>
+    <w:bookmarkEnd w:id="64"/>
+    <w:bookmarkEnd w:id="65"/>
   </w:p>
 </w:hdr>
 </file>
@@ -10960,7 +13011,6 @@
   <w:style w:type="character" w:default="1" w:styleId="Fuentedeprrafopredeter">
     <w:name w:val="Default Paragraph Font"/>
     <w:uiPriority w:val="1"/>
-    <w:semiHidden/>
     <w:unhideWhenUsed/>
   </w:style>
   <w:style w:type="table" w:default="1" w:styleId="Tablanormal">

</xml_diff>